<commit_message>
Fix timing inconsistencies in policy brief clinic materials
QA/QC review found: Exercise Part 1 step breakdown exceeded 30 min
header (was 35 min), Exercise Part 2 and Slide 12 said 45 min but
sub-steps totaled 40 min, guide referenced .md instead of .pptx.
Harmonized all timing across slides, exercise, and guide. Regenerated
Word and PPT outputs.

Co-Authored-By: Claude Opus 4.6 (1M context) <noreply@anthropic.com>
</commit_message>
<xml_diff>
--- a/s-s-event-bogor/sessions/day-3/policy-brief-clinic/policy-brief-exercise.docx
+++ b/s-s-event-bogor/sessions/day-3/policy-brief-clinic/policy-brief-exercise.docx
@@ -66,7 +66,16 @@
         <w:pStyle w:val="Heading3"/>
       </w:pPr>
       <w:r>
-        <w:t>Step 1: Identify your audience (5 minutes)</w:t>
+        <w:t>Step 1: Identify your audience</w:t>
+      </w:r>
+    </w:p>
+    <w:p>
+      <w:pPr/>
+      <w:r>
+        <w:rPr>
+          <w:color w:val="30302F"/>
+        </w:rPr>
+        <w:t>Start here. This should take about 2 minutes.</w:t>
       </w:r>
     </w:p>
     <w:p>
@@ -489,7 +498,7 @@
         <w:pStyle w:val="Heading3"/>
       </w:pPr>
       <w:r>
-        <w:t>Step 2: Fill in your Message Box (20 minutes)</w:t>
+        <w:t>Step 2: Fill in your Message Box (18 minutes)</w:t>
       </w:r>
     </w:p>
     <w:p>
@@ -843,7 +852,7 @@
         <w:pStyle w:val="Heading2"/>
       </w:pPr>
       <w:r>
-        <w:t>Part 2: Draft your policy brief (45 minutes)</w:t>
+        <w:t>Part 2: Draft your policy brief (40 minutes)</w:t>
       </w:r>
     </w:p>
     <w:p>

</xml_diff>

<commit_message>
Fix Word doc formatting: table spacing, autofit, cell padding, orphaned titles
Applied doc-format-qa fixes plus additional passes for:
- Table autofit to window width (100% page width)
- 6pt spacing before and after every table
- 4pt GOAP-standard cell padding on all table cells
- Bold markdown artifacts cleaned
- Orphaned titles kept with their tables

Co-Authored-By: Claude Opus 4.6 (1M context) <noreply@anthropic.com>
</commit_message>
<xml_diff>
--- a/s-s-event-bogor/sessions/day-3/policy-brief-clinic/policy-brief-exercise.docx
+++ b/s-s-event-bogor/sessions/day-3/policy-brief-clinic/policy-brief-exercise.docx
@@ -64,13 +64,16 @@
     <w:p>
       <w:pPr>
         <w:pStyle w:val="Heading3"/>
+        <w:keepNext w:val="true"/>
       </w:pPr>
       <w:r>
         <w:t>Step 1: Identify your audience</w:t>
       </w:r>
     </w:p>
     <w:p>
-      <w:pPr/>
+      <w:pPr>
+        <w:keepNext w:val="true"/>
+      </w:pPr>
       <w:r>
         <w:rPr>
           <w:color w:val="30302F"/>
@@ -79,7 +82,10 @@
       </w:r>
     </w:p>
     <w:p>
-      <w:pPr/>
+      <w:pPr>
+        <w:keepNext w:val="true"/>
+        <w:spacing w:after="120"/>
+      </w:pPr>
       <w:r>
         <w:rPr>
           <w:color w:val="30302F"/>
@@ -89,25 +95,22 @@
     </w:p>
     <w:tbl>
       <w:tblPr>
-        <w:tblW w:type="auto" w:w="0"/>
         <w:jc w:val="center"/>
-        <w:tblLayout w:type="autofit"/>
         <w:tblLook w:firstColumn="1" w:firstRow="1" w:lastColumn="0" w:lastRow="0" w:noHBand="0" w:noVBand="1" w:val="04A0"/>
+        <w:tblW w:w="5000" w:type="pct"/>
+        <w:tblLayout w:type="fixed"/>
       </w:tblPr>
       <w:tblGrid>
         <w:gridCol w:w="4536"/>
         <w:gridCol w:w="4536"/>
       </w:tblGrid>
       <w:tr>
+        <w:trPr>
+          <w:cantSplit w:val="true"/>
+        </w:trPr>
         <w:tc>
           <w:tcPr>
-            <w:tcW w:type="dxa" w:w="4536"/>
-            <w:tcMar>
-              <w:top w:w="57" w:type="dxa"/>
-              <w:bottom w:w="57" w:type="dxa"/>
-              <w:left w:w="57" w:type="dxa"/>
-              <w:right w:w="57" w:type="dxa"/>
-            </w:tcMar>
+            <w:tcW w:type="dxa" w:w="7248"/>
             <w:tcBorders>
               <w:top w:val="single" w:sz="8" w:space="0" w:color="404040"/>
               <w:bottom w:val="single" w:sz="8" w:space="0" w:color="404040"/>
@@ -115,10 +118,17 @@
               <w:right w:val="single" w:sz="8" w:space="0" w:color="404040"/>
             </w:tcBorders>
             <w:shd w:fill="0A5455" w:val="clear"/>
+            <w:tcMar>
+              <w:top w:w="80" w:type="dxa"/>
+              <w:bottom w:w="80" w:type="dxa"/>
+              <w:left w:w="80" w:type="dxa"/>
+              <w:right w:w="80" w:type="dxa"/>
+            </w:tcMar>
           </w:tcPr>
           <w:p>
             <w:pPr>
               <w:spacing w:before="80" w:after="80"/>
+              <w:keepNext w:val="true"/>
             </w:pPr>
             <w:r>
               <w:rPr>
@@ -141,13 +151,7 @@
         </w:tc>
         <w:tc>
           <w:tcPr>
-            <w:tcW w:type="dxa" w:w="4536"/>
-            <w:tcMar>
-              <w:top w:w="57" w:type="dxa"/>
-              <w:bottom w:w="57" w:type="dxa"/>
-              <w:left w:w="57" w:type="dxa"/>
-              <w:right w:w="57" w:type="dxa"/>
-            </w:tcMar>
+            <w:tcW w:type="dxa" w:w="2390"/>
             <w:tcBorders>
               <w:top w:val="single" w:sz="8" w:space="0" w:color="404040"/>
               <w:bottom w:val="single" w:sz="8" w:space="0" w:color="404040"/>
@@ -155,10 +159,17 @@
               <w:right w:val="single" w:sz="8" w:space="0" w:color="404040"/>
             </w:tcBorders>
             <w:shd w:fill="3B9C7B" w:val="clear"/>
+            <w:tcMar>
+              <w:top w:w="80" w:type="dxa"/>
+              <w:bottom w:w="80" w:type="dxa"/>
+              <w:left w:w="80" w:type="dxa"/>
+              <w:right w:w="80" w:type="dxa"/>
+            </w:tcMar>
           </w:tcPr>
           <w:p>
             <w:pPr>
               <w:spacing w:before="80" w:after="80"/>
+              <w:keepNext w:val="true"/>
             </w:pPr>
             <w:r>
               <w:rPr>
@@ -181,15 +192,12 @@
         </w:tc>
       </w:tr>
       <w:tr>
+        <w:trPr>
+          <w:cantSplit w:val="true"/>
+        </w:trPr>
         <w:tc>
           <w:tcPr>
-            <w:tcW w:type="dxa" w:w="4536"/>
-            <w:tcMar>
-              <w:top w:w="57" w:type="dxa"/>
-              <w:bottom w:w="57" w:type="dxa"/>
-              <w:left w:w="57" w:type="dxa"/>
-              <w:right w:w="57" w:type="dxa"/>
-            </w:tcMar>
+            <w:tcW w:type="dxa" w:w="7248"/>
             <w:tcBorders>
               <w:top w:val="single" w:sz="8" w:space="0" w:color="404040"/>
               <w:bottom w:val="single" w:sz="8" w:space="0" w:color="404040"/>
@@ -197,10 +205,17 @@
               <w:right w:val="single" w:sz="8" w:space="0" w:color="404040"/>
             </w:tcBorders>
             <w:shd w:fill="0A5455" w:val="clear"/>
+            <w:tcMar>
+              <w:top w:w="80" w:type="dxa"/>
+              <w:bottom w:w="80" w:type="dxa"/>
+              <w:left w:w="80" w:type="dxa"/>
+              <w:right w:w="80" w:type="dxa"/>
+            </w:tcMar>
           </w:tcPr>
           <w:p>
             <w:pPr>
               <w:spacing w:before="80" w:after="80"/>
+              <w:keepNext w:val="true"/>
             </w:pPr>
             <w:r>
               <w:rPr>
@@ -223,23 +238,24 @@
         </w:tc>
         <w:tc>
           <w:tcPr>
-            <w:tcW w:type="dxa" w:w="4536"/>
-            <w:tcMar>
-              <w:top w:w="57" w:type="dxa"/>
-              <w:bottom w:w="57" w:type="dxa"/>
-              <w:left w:w="57" w:type="dxa"/>
-              <w:right w:w="57" w:type="dxa"/>
-            </w:tcMar>
+            <w:tcW w:type="dxa" w:w="2390"/>
             <w:tcBorders>
               <w:top w:val="single" w:sz="8" w:space="0" w:color="404040"/>
               <w:bottom w:val="single" w:sz="8" w:space="0" w:color="404040"/>
               <w:left w:val="single" w:sz="8" w:space="0" w:color="404040"/>
               <w:right w:val="single" w:sz="8" w:space="0" w:color="404040"/>
             </w:tcBorders>
+            <w:tcMar>
+              <w:top w:w="80" w:type="dxa"/>
+              <w:bottom w:w="80" w:type="dxa"/>
+              <w:left w:w="80" w:type="dxa"/>
+              <w:right w:w="80" w:type="dxa"/>
+            </w:tcMar>
           </w:tcPr>
           <w:p>
             <w:pPr>
               <w:spacing w:before="80" w:after="80"/>
+              <w:keepNext w:val="true"/>
             </w:pPr>
             <w:r>
               <w:rPr>
@@ -259,15 +275,12 @@
         </w:tc>
       </w:tr>
       <w:tr>
+        <w:trPr>
+          <w:cantSplit w:val="true"/>
+        </w:trPr>
         <w:tc>
           <w:tcPr>
-            <w:tcW w:type="dxa" w:w="4536"/>
-            <w:tcMar>
-              <w:top w:w="57" w:type="dxa"/>
-              <w:bottom w:w="57" w:type="dxa"/>
-              <w:left w:w="57" w:type="dxa"/>
-              <w:right w:w="57" w:type="dxa"/>
-            </w:tcMar>
+            <w:tcW w:type="dxa" w:w="7248"/>
             <w:tcBorders>
               <w:top w:val="single" w:sz="8" w:space="0" w:color="404040"/>
               <w:bottom w:val="single" w:sz="8" w:space="0" w:color="404040"/>
@@ -275,10 +288,17 @@
               <w:right w:val="single" w:sz="8" w:space="0" w:color="404040"/>
             </w:tcBorders>
             <w:shd w:fill="0A5455" w:val="clear"/>
+            <w:tcMar>
+              <w:top w:w="80" w:type="dxa"/>
+              <w:bottom w:w="80" w:type="dxa"/>
+              <w:left w:w="80" w:type="dxa"/>
+              <w:right w:w="80" w:type="dxa"/>
+            </w:tcMar>
           </w:tcPr>
           <w:p>
             <w:pPr>
               <w:spacing w:before="80" w:after="80"/>
+              <w:keepNext w:val="true"/>
             </w:pPr>
             <w:r>
               <w:rPr>
@@ -301,23 +321,24 @@
         </w:tc>
         <w:tc>
           <w:tcPr>
-            <w:tcW w:type="dxa" w:w="4536"/>
-            <w:tcMar>
-              <w:top w:w="57" w:type="dxa"/>
-              <w:bottom w:w="57" w:type="dxa"/>
-              <w:left w:w="57" w:type="dxa"/>
-              <w:right w:w="57" w:type="dxa"/>
-            </w:tcMar>
+            <w:tcW w:type="dxa" w:w="2390"/>
             <w:tcBorders>
               <w:top w:val="single" w:sz="8" w:space="0" w:color="404040"/>
               <w:bottom w:val="single" w:sz="8" w:space="0" w:color="404040"/>
               <w:left w:val="single" w:sz="8" w:space="0" w:color="404040"/>
               <w:right w:val="single" w:sz="8" w:space="0" w:color="404040"/>
             </w:tcBorders>
+            <w:tcMar>
+              <w:top w:w="80" w:type="dxa"/>
+              <w:bottom w:w="80" w:type="dxa"/>
+              <w:left w:w="80" w:type="dxa"/>
+              <w:right w:w="80" w:type="dxa"/>
+            </w:tcMar>
           </w:tcPr>
           <w:p>
             <w:pPr>
               <w:spacing w:before="80" w:after="80"/>
+              <w:keepNext w:val="true"/>
             </w:pPr>
             <w:r>
               <w:rPr>
@@ -337,15 +358,12 @@
         </w:tc>
       </w:tr>
       <w:tr>
+        <w:trPr>
+          <w:cantSplit w:val="true"/>
+        </w:trPr>
         <w:tc>
           <w:tcPr>
-            <w:tcW w:type="dxa" w:w="4536"/>
-            <w:tcMar>
-              <w:top w:w="57" w:type="dxa"/>
-              <w:bottom w:w="57" w:type="dxa"/>
-              <w:left w:w="57" w:type="dxa"/>
-              <w:right w:w="57" w:type="dxa"/>
-            </w:tcMar>
+            <w:tcW w:type="dxa" w:w="7248"/>
             <w:tcBorders>
               <w:top w:val="single" w:sz="8" w:space="0" w:color="404040"/>
               <w:bottom w:val="single" w:sz="8" w:space="0" w:color="404040"/>
@@ -353,6 +371,12 @@
               <w:right w:val="single" w:sz="8" w:space="0" w:color="404040"/>
             </w:tcBorders>
             <w:shd w:fill="0A5455" w:val="clear"/>
+            <w:tcMar>
+              <w:top w:w="80" w:type="dxa"/>
+              <w:bottom w:w="80" w:type="dxa"/>
+              <w:left w:w="80" w:type="dxa"/>
+              <w:right w:w="80" w:type="dxa"/>
+            </w:tcMar>
           </w:tcPr>
           <w:p>
             <w:pPr>
@@ -379,19 +403,19 @@
         </w:tc>
         <w:tc>
           <w:tcPr>
-            <w:tcW w:type="dxa" w:w="4536"/>
-            <w:tcMar>
-              <w:top w:w="57" w:type="dxa"/>
-              <w:bottom w:w="57" w:type="dxa"/>
-              <w:left w:w="57" w:type="dxa"/>
-              <w:right w:w="57" w:type="dxa"/>
-            </w:tcMar>
+            <w:tcW w:type="dxa" w:w="2390"/>
             <w:tcBorders>
               <w:top w:val="single" w:sz="8" w:space="0" w:color="404040"/>
               <w:bottom w:val="single" w:sz="8" w:space="0" w:color="404040"/>
               <w:left w:val="single" w:sz="8" w:space="0" w:color="404040"/>
               <w:right w:val="single" w:sz="8" w:space="0" w:color="404040"/>
             </w:tcBorders>
+            <w:tcMar>
+              <w:top w:w="80" w:type="dxa"/>
+              <w:bottom w:w="80" w:type="dxa"/>
+              <w:left w:w="80" w:type="dxa"/>
+              <w:right w:w="80" w:type="dxa"/>
+            </w:tcMar>
           </w:tcPr>
           <w:p>
             <w:pPr>
@@ -415,15 +439,12 @@
         </w:tc>
       </w:tr>
       <w:tr>
+        <w:trPr>
+          <w:cantSplit w:val="true"/>
+        </w:trPr>
         <w:tc>
           <w:tcPr>
-            <w:tcW w:type="dxa" w:w="4536"/>
-            <w:tcMar>
-              <w:top w:w="57" w:type="dxa"/>
-              <w:bottom w:w="57" w:type="dxa"/>
-              <w:left w:w="57" w:type="dxa"/>
-              <w:right w:w="57" w:type="dxa"/>
-            </w:tcMar>
+            <w:tcW w:type="dxa" w:w="7248"/>
             <w:tcBorders>
               <w:top w:val="single" w:sz="8" w:space="0" w:color="404040"/>
               <w:bottom w:val="single" w:sz="8" w:space="0" w:color="404040"/>
@@ -431,6 +452,12 @@
               <w:right w:val="single" w:sz="8" w:space="0" w:color="404040"/>
             </w:tcBorders>
             <w:shd w:fill="0A5455" w:val="clear"/>
+            <w:tcMar>
+              <w:top w:w="80" w:type="dxa"/>
+              <w:bottom w:w="80" w:type="dxa"/>
+              <w:left w:w="80" w:type="dxa"/>
+              <w:right w:w="80" w:type="dxa"/>
+            </w:tcMar>
           </w:tcPr>
           <w:p>
             <w:pPr>
@@ -451,25 +478,25 @@
                 <w:color w:val="FFFFFF"/>
                 <w:sz w:val="20"/>
               </w:rPr>
-              <w:t>**My target reader is:**</w:t>
+              <w:t>My target reader is:</w:t>
             </w:r>
           </w:p>
         </w:tc>
         <w:tc>
           <w:tcPr>
-            <w:tcW w:type="dxa" w:w="4536"/>
-            <w:tcMar>
-              <w:top w:w="57" w:type="dxa"/>
-              <w:bottom w:w="57" w:type="dxa"/>
-              <w:left w:w="57" w:type="dxa"/>
-              <w:right w:w="57" w:type="dxa"/>
-            </w:tcMar>
+            <w:tcW w:type="dxa" w:w="2390"/>
             <w:tcBorders>
               <w:top w:val="single" w:sz="8" w:space="0" w:color="404040"/>
               <w:bottom w:val="single" w:sz="8" w:space="0" w:color="404040"/>
               <w:left w:val="single" w:sz="8" w:space="0" w:color="404040"/>
               <w:right w:val="single" w:sz="8" w:space="0" w:color="404040"/>
             </w:tcBorders>
+            <w:tcMar>
+              <w:top w:w="80" w:type="dxa"/>
+              <w:bottom w:w="80" w:type="dxa"/>
+              <w:left w:w="80" w:type="dxa"/>
+              <w:right w:w="80" w:type="dxa"/>
+            </w:tcMar>
           </w:tcPr>
           <w:p>
             <w:pPr>
@@ -496,6 +523,7 @@
     <w:p>
       <w:pPr>
         <w:pStyle w:val="Heading3"/>
+        <w:spacing w:before="120"/>
       </w:pPr>
       <w:r>
         <w:t>Step 2: Fill in your Message Box (18 minutes)</w:t>
@@ -1212,6 +1240,7 @@
     <w:p>
       <w:pPr>
         <w:pStyle w:val="ListBullet"/>
+        <w:keepNext w:val="true"/>
       </w:pPr>
       <w:r>
         <w:rPr>
@@ -1223,13 +1252,17 @@
     <w:p>
       <w:pPr>
         <w:pStyle w:val="Heading3"/>
+        <w:keepNext w:val="true"/>
       </w:pPr>
       <w:r>
         <w:t>Account-type adaptation table</w:t>
       </w:r>
     </w:p>
     <w:p>
-      <w:pPr/>
+      <w:pPr>
+        <w:keepNext w:val="true"/>
+        <w:spacing w:after="120"/>
+      </w:pPr>
       <w:r>
         <w:rPr>
           <w:color w:val="30302F"/>
@@ -1239,10 +1272,10 @@
     </w:p>
     <w:tbl>
       <w:tblPr>
-        <w:tblW w:type="auto" w:w="0"/>
         <w:jc w:val="center"/>
-        <w:tblLayout w:type="autofit"/>
         <w:tblLook w:firstColumn="1" w:firstRow="1" w:lastColumn="0" w:lastRow="0" w:noHBand="0" w:noVBand="1" w:val="04A0"/>
+        <w:tblW w:w="5000" w:type="pct"/>
+        <w:tblLayout w:type="fixed"/>
       </w:tblPr>
       <w:tblGrid>
         <w:gridCol w:w="3024"/>
@@ -1250,15 +1283,12 @@
         <w:gridCol w:w="3024"/>
       </w:tblGrid>
       <w:tr>
+        <w:trPr>
+          <w:cantSplit w:val="true"/>
+        </w:trPr>
         <w:tc>
           <w:tcPr>
-            <w:tcW w:type="dxa" w:w="3024"/>
-            <w:tcMar>
-              <w:top w:w="57" w:type="dxa"/>
-              <w:bottom w:w="57" w:type="dxa"/>
-              <w:left w:w="57" w:type="dxa"/>
-              <w:right w:w="57" w:type="dxa"/>
-            </w:tcMar>
+            <w:tcW w:type="dxa" w:w="1080"/>
             <w:tcBorders>
               <w:top w:val="single" w:sz="8" w:space="0" w:color="404040"/>
               <w:bottom w:val="single" w:sz="8" w:space="0" w:color="404040"/>
@@ -1266,10 +1296,17 @@
               <w:right w:val="single" w:sz="8" w:space="0" w:color="404040"/>
             </w:tcBorders>
             <w:shd w:fill="0A5455" w:val="clear"/>
+            <w:tcMar>
+              <w:top w:w="80" w:type="dxa"/>
+              <w:bottom w:w="80" w:type="dxa"/>
+              <w:left w:w="80" w:type="dxa"/>
+              <w:right w:w="80" w:type="dxa"/>
+            </w:tcMar>
           </w:tcPr>
           <w:p>
             <w:pPr>
               <w:spacing w:before="80" w:after="80"/>
+              <w:keepNext w:val="true"/>
             </w:pPr>
             <w:r>
               <w:rPr>
@@ -1292,13 +1329,7 @@
         </w:tc>
         <w:tc>
           <w:tcPr>
-            <w:tcW w:type="dxa" w:w="3024"/>
-            <w:tcMar>
-              <w:top w:w="57" w:type="dxa"/>
-              <w:bottom w:w="57" w:type="dxa"/>
-              <w:left w:w="57" w:type="dxa"/>
-              <w:right w:w="57" w:type="dxa"/>
-            </w:tcMar>
+            <w:tcW w:type="dxa" w:w="3431"/>
             <w:tcBorders>
               <w:top w:val="single" w:sz="8" w:space="0" w:color="404040"/>
               <w:bottom w:val="single" w:sz="8" w:space="0" w:color="404040"/>
@@ -1306,10 +1337,17 @@
               <w:right w:val="single" w:sz="8" w:space="0" w:color="404040"/>
             </w:tcBorders>
             <w:shd w:fill="3B9C7B" w:val="clear"/>
+            <w:tcMar>
+              <w:top w:w="80" w:type="dxa"/>
+              <w:bottom w:w="80" w:type="dxa"/>
+              <w:left w:w="80" w:type="dxa"/>
+              <w:right w:w="80" w:type="dxa"/>
+            </w:tcMar>
           </w:tcPr>
           <w:p>
             <w:pPr>
               <w:spacing w:before="80" w:after="80"/>
+              <w:keepNext w:val="true"/>
             </w:pPr>
             <w:r>
               <w:rPr>
@@ -1332,13 +1370,7 @@
         </w:tc>
         <w:tc>
           <w:tcPr>
-            <w:tcW w:type="dxa" w:w="3024"/>
-            <w:tcMar>
-              <w:top w:w="57" w:type="dxa"/>
-              <w:bottom w:w="57" w:type="dxa"/>
-              <w:left w:w="57" w:type="dxa"/>
-              <w:right w:w="57" w:type="dxa"/>
-            </w:tcMar>
+            <w:tcW w:type="dxa" w:w="5127"/>
             <w:tcBorders>
               <w:top w:val="single" w:sz="8" w:space="0" w:color="404040"/>
               <w:bottom w:val="single" w:sz="8" w:space="0" w:color="404040"/>
@@ -1346,10 +1378,17 @@
               <w:right w:val="single" w:sz="8" w:space="0" w:color="404040"/>
             </w:tcBorders>
             <w:shd w:fill="3B9C7B" w:val="clear"/>
+            <w:tcMar>
+              <w:top w:w="80" w:type="dxa"/>
+              <w:bottom w:w="80" w:type="dxa"/>
+              <w:left w:w="80" w:type="dxa"/>
+              <w:right w:w="80" w:type="dxa"/>
+            </w:tcMar>
           </w:tcPr>
           <w:p>
             <w:pPr>
               <w:spacing w:before="80" w:after="80"/>
+              <w:keepNext w:val="true"/>
             </w:pPr>
             <w:r>
               <w:rPr>
@@ -1372,15 +1411,12 @@
         </w:tc>
       </w:tr>
       <w:tr>
+        <w:trPr>
+          <w:cantSplit w:val="true"/>
+        </w:trPr>
         <w:tc>
           <w:tcPr>
-            <w:tcW w:type="dxa" w:w="3024"/>
-            <w:tcMar>
-              <w:top w:w="57" w:type="dxa"/>
-              <w:bottom w:w="57" w:type="dxa"/>
-              <w:left w:w="57" w:type="dxa"/>
-              <w:right w:w="57" w:type="dxa"/>
-            </w:tcMar>
+            <w:tcW w:type="dxa" w:w="1080"/>
             <w:tcBorders>
               <w:top w:val="single" w:sz="8" w:space="0" w:color="404040"/>
               <w:bottom w:val="single" w:sz="8" w:space="0" w:color="404040"/>
@@ -1388,10 +1424,17 @@
               <w:right w:val="single" w:sz="8" w:space="0" w:color="404040"/>
             </w:tcBorders>
             <w:shd w:fill="0A5455" w:val="clear"/>
+            <w:tcMar>
+              <w:top w:w="80" w:type="dxa"/>
+              <w:bottom w:w="80" w:type="dxa"/>
+              <w:left w:w="80" w:type="dxa"/>
+              <w:right w:w="80" w:type="dxa"/>
+            </w:tcMar>
           </w:tcPr>
           <w:p>
             <w:pPr>
               <w:spacing w:before="80" w:after="80"/>
+              <w:keepNext w:val="true"/>
             </w:pPr>
             <w:r>
               <w:rPr>
@@ -1414,23 +1457,24 @@
         </w:tc>
         <w:tc>
           <w:tcPr>
-            <w:tcW w:type="dxa" w:w="3024"/>
-            <w:tcMar>
-              <w:top w:w="57" w:type="dxa"/>
-              <w:bottom w:w="57" w:type="dxa"/>
-              <w:left w:w="57" w:type="dxa"/>
-              <w:right w:w="57" w:type="dxa"/>
-            </w:tcMar>
+            <w:tcW w:type="dxa" w:w="3431"/>
             <w:tcBorders>
               <w:top w:val="single" w:sz="8" w:space="0" w:color="404040"/>
               <w:bottom w:val="single" w:sz="8" w:space="0" w:color="404040"/>
               <w:left w:val="single" w:sz="8" w:space="0" w:color="404040"/>
               <w:right w:val="single" w:sz="8" w:space="0" w:color="404040"/>
             </w:tcBorders>
+            <w:tcMar>
+              <w:top w:w="80" w:type="dxa"/>
+              <w:bottom w:w="80" w:type="dxa"/>
+              <w:left w:w="80" w:type="dxa"/>
+              <w:right w:w="80" w:type="dxa"/>
+            </w:tcMar>
           </w:tcPr>
           <w:p>
             <w:pPr>
               <w:spacing w:before="80" w:after="80"/>
+              <w:keepNext w:val="true"/>
             </w:pPr>
             <w:r>
               <w:rPr>
@@ -1451,23 +1495,24 @@
         </w:tc>
         <w:tc>
           <w:tcPr>
-            <w:tcW w:type="dxa" w:w="3024"/>
-            <w:tcMar>
-              <w:top w:w="57" w:type="dxa"/>
-              <w:bottom w:w="57" w:type="dxa"/>
-              <w:left w:w="57" w:type="dxa"/>
-              <w:right w:w="57" w:type="dxa"/>
-            </w:tcMar>
+            <w:tcW w:type="dxa" w:w="5127"/>
             <w:tcBorders>
               <w:top w:val="single" w:sz="8" w:space="0" w:color="404040"/>
               <w:bottom w:val="single" w:sz="8" w:space="0" w:color="404040"/>
               <w:left w:val="single" w:sz="8" w:space="0" w:color="404040"/>
               <w:right w:val="single" w:sz="8" w:space="0" w:color="404040"/>
             </w:tcBorders>
+            <w:tcMar>
+              <w:top w:w="80" w:type="dxa"/>
+              <w:bottom w:w="80" w:type="dxa"/>
+              <w:left w:w="80" w:type="dxa"/>
+              <w:right w:w="80" w:type="dxa"/>
+            </w:tcMar>
           </w:tcPr>
           <w:p>
             <w:pPr>
               <w:spacing w:before="80" w:after="80"/>
+              <w:keepNext w:val="true"/>
             </w:pPr>
             <w:r>
               <w:rPr>
@@ -1488,15 +1533,12 @@
         </w:tc>
       </w:tr>
       <w:tr>
+        <w:trPr>
+          <w:cantSplit w:val="true"/>
+        </w:trPr>
         <w:tc>
           <w:tcPr>
-            <w:tcW w:type="dxa" w:w="3024"/>
-            <w:tcMar>
-              <w:top w:w="57" w:type="dxa"/>
-              <w:bottom w:w="57" w:type="dxa"/>
-              <w:left w:w="57" w:type="dxa"/>
-              <w:right w:w="57" w:type="dxa"/>
-            </w:tcMar>
+            <w:tcW w:type="dxa" w:w="1080"/>
             <w:tcBorders>
               <w:top w:val="single" w:sz="8" w:space="0" w:color="404040"/>
               <w:bottom w:val="single" w:sz="8" w:space="0" w:color="404040"/>
@@ -1504,10 +1546,17 @@
               <w:right w:val="single" w:sz="8" w:space="0" w:color="404040"/>
             </w:tcBorders>
             <w:shd w:fill="0A5455" w:val="clear"/>
+            <w:tcMar>
+              <w:top w:w="80" w:type="dxa"/>
+              <w:bottom w:w="80" w:type="dxa"/>
+              <w:left w:w="80" w:type="dxa"/>
+              <w:right w:w="80" w:type="dxa"/>
+            </w:tcMar>
           </w:tcPr>
           <w:p>
             <w:pPr>
               <w:spacing w:before="80" w:after="80"/>
+              <w:keepNext w:val="true"/>
             </w:pPr>
             <w:r>
               <w:rPr>
@@ -1530,23 +1579,24 @@
         </w:tc>
         <w:tc>
           <w:tcPr>
-            <w:tcW w:type="dxa" w:w="3024"/>
-            <w:tcMar>
-              <w:top w:w="57" w:type="dxa"/>
-              <w:bottom w:w="57" w:type="dxa"/>
-              <w:left w:w="57" w:type="dxa"/>
-              <w:right w:w="57" w:type="dxa"/>
-            </w:tcMar>
+            <w:tcW w:type="dxa" w:w="3431"/>
             <w:tcBorders>
               <w:top w:val="single" w:sz="8" w:space="0" w:color="404040"/>
               <w:bottom w:val="single" w:sz="8" w:space="0" w:color="404040"/>
               <w:left w:val="single" w:sz="8" w:space="0" w:color="404040"/>
               <w:right w:val="single" w:sz="8" w:space="0" w:color="404040"/>
             </w:tcBorders>
+            <w:tcMar>
+              <w:top w:w="80" w:type="dxa"/>
+              <w:bottom w:w="80" w:type="dxa"/>
+              <w:left w:w="80" w:type="dxa"/>
+              <w:right w:w="80" w:type="dxa"/>
+            </w:tcMar>
           </w:tcPr>
           <w:p>
             <w:pPr>
               <w:spacing w:before="80" w:after="80"/>
+              <w:keepNext w:val="true"/>
             </w:pPr>
             <w:r>
               <w:rPr>
@@ -1567,23 +1617,24 @@
         </w:tc>
         <w:tc>
           <w:tcPr>
-            <w:tcW w:type="dxa" w:w="3024"/>
-            <w:tcMar>
-              <w:top w:w="57" w:type="dxa"/>
-              <w:bottom w:w="57" w:type="dxa"/>
-              <w:left w:w="57" w:type="dxa"/>
-              <w:right w:w="57" w:type="dxa"/>
-            </w:tcMar>
+            <w:tcW w:type="dxa" w:w="5127"/>
             <w:tcBorders>
               <w:top w:val="single" w:sz="8" w:space="0" w:color="404040"/>
               <w:bottom w:val="single" w:sz="8" w:space="0" w:color="404040"/>
               <w:left w:val="single" w:sz="8" w:space="0" w:color="404040"/>
               <w:right w:val="single" w:sz="8" w:space="0" w:color="404040"/>
             </w:tcBorders>
+            <w:tcMar>
+              <w:top w:w="80" w:type="dxa"/>
+              <w:bottom w:w="80" w:type="dxa"/>
+              <w:left w:w="80" w:type="dxa"/>
+              <w:right w:w="80" w:type="dxa"/>
+            </w:tcMar>
           </w:tcPr>
           <w:p>
             <w:pPr>
               <w:spacing w:before="80" w:after="80"/>
+              <w:keepNext w:val="true"/>
             </w:pPr>
             <w:r>
               <w:rPr>
@@ -1604,15 +1655,12 @@
         </w:tc>
       </w:tr>
       <w:tr>
+        <w:trPr>
+          <w:cantSplit w:val="true"/>
+        </w:trPr>
         <w:tc>
           <w:tcPr>
-            <w:tcW w:type="dxa" w:w="3024"/>
-            <w:tcMar>
-              <w:top w:w="57" w:type="dxa"/>
-              <w:bottom w:w="57" w:type="dxa"/>
-              <w:left w:w="57" w:type="dxa"/>
-              <w:right w:w="57" w:type="dxa"/>
-            </w:tcMar>
+            <w:tcW w:type="dxa" w:w="1080"/>
             <w:tcBorders>
               <w:top w:val="single" w:sz="8" w:space="0" w:color="404040"/>
               <w:bottom w:val="single" w:sz="8" w:space="0" w:color="404040"/>
@@ -1620,6 +1668,12 @@
               <w:right w:val="single" w:sz="8" w:space="0" w:color="404040"/>
             </w:tcBorders>
             <w:shd w:fill="0A5455" w:val="clear"/>
+            <w:tcMar>
+              <w:top w:w="80" w:type="dxa"/>
+              <w:bottom w:w="80" w:type="dxa"/>
+              <w:left w:w="80" w:type="dxa"/>
+              <w:right w:w="80" w:type="dxa"/>
+            </w:tcMar>
           </w:tcPr>
           <w:p>
             <w:pPr>
@@ -1646,19 +1700,19 @@
         </w:tc>
         <w:tc>
           <w:tcPr>
-            <w:tcW w:type="dxa" w:w="3024"/>
-            <w:tcMar>
-              <w:top w:w="57" w:type="dxa"/>
-              <w:bottom w:w="57" w:type="dxa"/>
-              <w:left w:w="57" w:type="dxa"/>
-              <w:right w:w="57" w:type="dxa"/>
-            </w:tcMar>
+            <w:tcW w:type="dxa" w:w="3431"/>
             <w:tcBorders>
               <w:top w:val="single" w:sz="8" w:space="0" w:color="404040"/>
               <w:bottom w:val="single" w:sz="8" w:space="0" w:color="404040"/>
               <w:left w:val="single" w:sz="8" w:space="0" w:color="404040"/>
               <w:right w:val="single" w:sz="8" w:space="0" w:color="404040"/>
             </w:tcBorders>
+            <w:tcMar>
+              <w:top w:w="80" w:type="dxa"/>
+              <w:bottom w:w="80" w:type="dxa"/>
+              <w:left w:w="80" w:type="dxa"/>
+              <w:right w:w="80" w:type="dxa"/>
+            </w:tcMar>
           </w:tcPr>
           <w:p>
             <w:pPr>
@@ -1683,19 +1737,19 @@
         </w:tc>
         <w:tc>
           <w:tcPr>
-            <w:tcW w:type="dxa" w:w="3024"/>
-            <w:tcMar>
-              <w:top w:w="57" w:type="dxa"/>
-              <w:bottom w:w="57" w:type="dxa"/>
-              <w:left w:w="57" w:type="dxa"/>
-              <w:right w:w="57" w:type="dxa"/>
-            </w:tcMar>
+            <w:tcW w:type="dxa" w:w="5127"/>
             <w:tcBorders>
               <w:top w:val="single" w:sz="8" w:space="0" w:color="404040"/>
               <w:bottom w:val="single" w:sz="8" w:space="0" w:color="404040"/>
               <w:left w:val="single" w:sz="8" w:space="0" w:color="404040"/>
               <w:right w:val="single" w:sz="8" w:space="0" w:color="404040"/>
             </w:tcBorders>
+            <w:tcMar>
+              <w:top w:w="80" w:type="dxa"/>
+              <w:bottom w:w="80" w:type="dxa"/>
+              <w:left w:w="80" w:type="dxa"/>
+              <w:right w:w="80" w:type="dxa"/>
+            </w:tcMar>
           </w:tcPr>
           <w:p>
             <w:pPr>
@@ -1720,15 +1774,12 @@
         </w:tc>
       </w:tr>
       <w:tr>
+        <w:trPr>
+          <w:cantSplit w:val="true"/>
+        </w:trPr>
         <w:tc>
           <w:tcPr>
-            <w:tcW w:type="dxa" w:w="3024"/>
-            <w:tcMar>
-              <w:top w:w="57" w:type="dxa"/>
-              <w:bottom w:w="57" w:type="dxa"/>
-              <w:left w:w="57" w:type="dxa"/>
-              <w:right w:w="57" w:type="dxa"/>
-            </w:tcMar>
+            <w:tcW w:type="dxa" w:w="1080"/>
             <w:tcBorders>
               <w:top w:val="single" w:sz="8" w:space="0" w:color="404040"/>
               <w:bottom w:val="single" w:sz="8" w:space="0" w:color="404040"/>
@@ -1736,6 +1787,12 @@
               <w:right w:val="single" w:sz="8" w:space="0" w:color="404040"/>
             </w:tcBorders>
             <w:shd w:fill="0A5455" w:val="clear"/>
+            <w:tcMar>
+              <w:top w:w="80" w:type="dxa"/>
+              <w:bottom w:w="80" w:type="dxa"/>
+              <w:left w:w="80" w:type="dxa"/>
+              <w:right w:w="80" w:type="dxa"/>
+            </w:tcMar>
           </w:tcPr>
           <w:p>
             <w:pPr>
@@ -1762,19 +1819,19 @@
         </w:tc>
         <w:tc>
           <w:tcPr>
-            <w:tcW w:type="dxa" w:w="3024"/>
-            <w:tcMar>
-              <w:top w:w="57" w:type="dxa"/>
-              <w:bottom w:w="57" w:type="dxa"/>
-              <w:left w:w="57" w:type="dxa"/>
-              <w:right w:w="57" w:type="dxa"/>
-            </w:tcMar>
+            <w:tcW w:type="dxa" w:w="3431"/>
             <w:tcBorders>
               <w:top w:val="single" w:sz="8" w:space="0" w:color="404040"/>
               <w:bottom w:val="single" w:sz="8" w:space="0" w:color="404040"/>
               <w:left w:val="single" w:sz="8" w:space="0" w:color="404040"/>
               <w:right w:val="single" w:sz="8" w:space="0" w:color="404040"/>
             </w:tcBorders>
+            <w:tcMar>
+              <w:top w:w="80" w:type="dxa"/>
+              <w:bottom w:w="80" w:type="dxa"/>
+              <w:left w:w="80" w:type="dxa"/>
+              <w:right w:w="80" w:type="dxa"/>
+            </w:tcMar>
           </w:tcPr>
           <w:p>
             <w:pPr>
@@ -1799,19 +1856,19 @@
         </w:tc>
         <w:tc>
           <w:tcPr>
-            <w:tcW w:type="dxa" w:w="3024"/>
-            <w:tcMar>
-              <w:top w:w="57" w:type="dxa"/>
-              <w:bottom w:w="57" w:type="dxa"/>
-              <w:left w:w="57" w:type="dxa"/>
-              <w:right w:w="57" w:type="dxa"/>
-            </w:tcMar>
+            <w:tcW w:type="dxa" w:w="5127"/>
             <w:tcBorders>
               <w:top w:val="single" w:sz="8" w:space="0" w:color="404040"/>
               <w:bottom w:val="single" w:sz="8" w:space="0" w:color="404040"/>
               <w:left w:val="single" w:sz="8" w:space="0" w:color="404040"/>
               <w:right w:val="single" w:sz="8" w:space="0" w:color="404040"/>
             </w:tcBorders>
+            <w:tcMar>
+              <w:top w:w="80" w:type="dxa"/>
+              <w:bottom w:w="80" w:type="dxa"/>
+              <w:left w:w="80" w:type="dxa"/>
+              <w:right w:w="80" w:type="dxa"/>
+            </w:tcMar>
           </w:tcPr>
           <w:p>
             <w:pPr>
@@ -1836,15 +1893,12 @@
         </w:tc>
       </w:tr>
       <w:tr>
+        <w:trPr>
+          <w:cantSplit w:val="true"/>
+        </w:trPr>
         <w:tc>
           <w:tcPr>
-            <w:tcW w:type="dxa" w:w="3024"/>
-            <w:tcMar>
-              <w:top w:w="57" w:type="dxa"/>
-              <w:bottom w:w="57" w:type="dxa"/>
-              <w:left w:w="57" w:type="dxa"/>
-              <w:right w:w="57" w:type="dxa"/>
-            </w:tcMar>
+            <w:tcW w:type="dxa" w:w="1080"/>
             <w:tcBorders>
               <w:top w:val="single" w:sz="8" w:space="0" w:color="404040"/>
               <w:bottom w:val="single" w:sz="8" w:space="0" w:color="404040"/>
@@ -1852,6 +1906,12 @@
               <w:right w:val="single" w:sz="8" w:space="0" w:color="404040"/>
             </w:tcBorders>
             <w:shd w:fill="0A5455" w:val="clear"/>
+            <w:tcMar>
+              <w:top w:w="80" w:type="dxa"/>
+              <w:bottom w:w="80" w:type="dxa"/>
+              <w:left w:w="80" w:type="dxa"/>
+              <w:right w:w="80" w:type="dxa"/>
+            </w:tcMar>
           </w:tcPr>
           <w:p>
             <w:pPr>
@@ -1878,19 +1938,19 @@
         </w:tc>
         <w:tc>
           <w:tcPr>
-            <w:tcW w:type="dxa" w:w="3024"/>
-            <w:tcMar>
-              <w:top w:w="57" w:type="dxa"/>
-              <w:bottom w:w="57" w:type="dxa"/>
-              <w:left w:w="57" w:type="dxa"/>
-              <w:right w:w="57" w:type="dxa"/>
-            </w:tcMar>
+            <w:tcW w:type="dxa" w:w="3431"/>
             <w:tcBorders>
               <w:top w:val="single" w:sz="8" w:space="0" w:color="404040"/>
               <w:bottom w:val="single" w:sz="8" w:space="0" w:color="404040"/>
               <w:left w:val="single" w:sz="8" w:space="0" w:color="404040"/>
               <w:right w:val="single" w:sz="8" w:space="0" w:color="404040"/>
             </w:tcBorders>
+            <w:tcMar>
+              <w:top w:w="80" w:type="dxa"/>
+              <w:bottom w:w="80" w:type="dxa"/>
+              <w:left w:w="80" w:type="dxa"/>
+              <w:right w:w="80" w:type="dxa"/>
+            </w:tcMar>
           </w:tcPr>
           <w:p>
             <w:pPr>
@@ -1915,19 +1975,19 @@
         </w:tc>
         <w:tc>
           <w:tcPr>
-            <w:tcW w:type="dxa" w:w="3024"/>
-            <w:tcMar>
-              <w:top w:w="57" w:type="dxa"/>
-              <w:bottom w:w="57" w:type="dxa"/>
-              <w:left w:w="57" w:type="dxa"/>
-              <w:right w:w="57" w:type="dxa"/>
-            </w:tcMar>
+            <w:tcW w:type="dxa" w:w="5127"/>
             <w:tcBorders>
               <w:top w:val="single" w:sz="8" w:space="0" w:color="404040"/>
               <w:bottom w:val="single" w:sz="8" w:space="0" w:color="404040"/>
               <w:left w:val="single" w:sz="8" w:space="0" w:color="404040"/>
               <w:right w:val="single" w:sz="8" w:space="0" w:color="404040"/>
             </w:tcBorders>
+            <w:tcMar>
+              <w:top w:w="80" w:type="dxa"/>
+              <w:bottom w:w="80" w:type="dxa"/>
+              <w:left w:w="80" w:type="dxa"/>
+              <w:right w:w="80" w:type="dxa"/>
+            </w:tcMar>
           </w:tcPr>
           <w:p>
             <w:pPr>
@@ -1952,15 +2012,12 @@
         </w:tc>
       </w:tr>
       <w:tr>
+        <w:trPr>
+          <w:cantSplit w:val="true"/>
+        </w:trPr>
         <w:tc>
           <w:tcPr>
-            <w:tcW w:type="dxa" w:w="3024"/>
-            <w:tcMar>
-              <w:top w:w="57" w:type="dxa"/>
-              <w:bottom w:w="57" w:type="dxa"/>
-              <w:left w:w="57" w:type="dxa"/>
-              <w:right w:w="57" w:type="dxa"/>
-            </w:tcMar>
+            <w:tcW w:type="dxa" w:w="1080"/>
             <w:tcBorders>
               <w:top w:val="single" w:sz="8" w:space="0" w:color="404040"/>
               <w:bottom w:val="single" w:sz="8" w:space="0" w:color="404040"/>
@@ -1968,6 +2025,12 @@
               <w:right w:val="single" w:sz="8" w:space="0" w:color="404040"/>
             </w:tcBorders>
             <w:shd w:fill="0A5455" w:val="clear"/>
+            <w:tcMar>
+              <w:top w:w="80" w:type="dxa"/>
+              <w:bottom w:w="80" w:type="dxa"/>
+              <w:left w:w="80" w:type="dxa"/>
+              <w:right w:w="80" w:type="dxa"/>
+            </w:tcMar>
           </w:tcPr>
           <w:p>
             <w:pPr>
@@ -1994,19 +2057,19 @@
         </w:tc>
         <w:tc>
           <w:tcPr>
-            <w:tcW w:type="dxa" w:w="3024"/>
-            <w:tcMar>
-              <w:top w:w="57" w:type="dxa"/>
-              <w:bottom w:w="57" w:type="dxa"/>
-              <w:left w:w="57" w:type="dxa"/>
-              <w:right w:w="57" w:type="dxa"/>
-            </w:tcMar>
+            <w:tcW w:type="dxa" w:w="3431"/>
             <w:tcBorders>
               <w:top w:val="single" w:sz="8" w:space="0" w:color="404040"/>
               <w:bottom w:val="single" w:sz="8" w:space="0" w:color="404040"/>
               <w:left w:val="single" w:sz="8" w:space="0" w:color="404040"/>
               <w:right w:val="single" w:sz="8" w:space="0" w:color="404040"/>
             </w:tcBorders>
+            <w:tcMar>
+              <w:top w:w="80" w:type="dxa"/>
+              <w:bottom w:w="80" w:type="dxa"/>
+              <w:left w:w="80" w:type="dxa"/>
+              <w:right w:w="80" w:type="dxa"/>
+            </w:tcMar>
           </w:tcPr>
           <w:p>
             <w:pPr>
@@ -2031,19 +2094,19 @@
         </w:tc>
         <w:tc>
           <w:tcPr>
-            <w:tcW w:type="dxa" w:w="3024"/>
-            <w:tcMar>
-              <w:top w:w="57" w:type="dxa"/>
-              <w:bottom w:w="57" w:type="dxa"/>
-              <w:left w:w="57" w:type="dxa"/>
-              <w:right w:w="57" w:type="dxa"/>
-            </w:tcMar>
+            <w:tcW w:type="dxa" w:w="5127"/>
             <w:tcBorders>
               <w:top w:val="single" w:sz="8" w:space="0" w:color="404040"/>
               <w:bottom w:val="single" w:sz="8" w:space="0" w:color="404040"/>
               <w:left w:val="single" w:sz="8" w:space="0" w:color="404040"/>
               <w:right w:val="single" w:sz="8" w:space="0" w:color="404040"/>
             </w:tcBorders>
+            <w:tcMar>
+              <w:top w:w="80" w:type="dxa"/>
+              <w:bottom w:w="80" w:type="dxa"/>
+              <w:left w:w="80" w:type="dxa"/>
+              <w:right w:w="80" w:type="dxa"/>
+            </w:tcMar>
           </w:tcPr>
           <w:p>
             <w:pPr>
@@ -2068,15 +2131,12 @@
         </w:tc>
       </w:tr>
       <w:tr>
+        <w:trPr>
+          <w:cantSplit w:val="true"/>
+        </w:trPr>
         <w:tc>
           <w:tcPr>
-            <w:tcW w:type="dxa" w:w="3024"/>
-            <w:tcMar>
-              <w:top w:w="57" w:type="dxa"/>
-              <w:bottom w:w="57" w:type="dxa"/>
-              <w:left w:w="57" w:type="dxa"/>
-              <w:right w:w="57" w:type="dxa"/>
-            </w:tcMar>
+            <w:tcW w:type="dxa" w:w="1080"/>
             <w:tcBorders>
               <w:top w:val="single" w:sz="8" w:space="0" w:color="404040"/>
               <w:bottom w:val="single" w:sz="8" w:space="0" w:color="404040"/>
@@ -2084,6 +2144,12 @@
               <w:right w:val="single" w:sz="8" w:space="0" w:color="404040"/>
             </w:tcBorders>
             <w:shd w:fill="0A5455" w:val="clear"/>
+            <w:tcMar>
+              <w:top w:w="80" w:type="dxa"/>
+              <w:bottom w:w="80" w:type="dxa"/>
+              <w:left w:w="80" w:type="dxa"/>
+              <w:right w:w="80" w:type="dxa"/>
+            </w:tcMar>
           </w:tcPr>
           <w:p>
             <w:pPr>
@@ -2110,19 +2176,19 @@
         </w:tc>
         <w:tc>
           <w:tcPr>
-            <w:tcW w:type="dxa" w:w="3024"/>
-            <w:tcMar>
-              <w:top w:w="57" w:type="dxa"/>
-              <w:bottom w:w="57" w:type="dxa"/>
-              <w:left w:w="57" w:type="dxa"/>
-              <w:right w:w="57" w:type="dxa"/>
-            </w:tcMar>
+            <w:tcW w:type="dxa" w:w="3431"/>
             <w:tcBorders>
               <w:top w:val="single" w:sz="8" w:space="0" w:color="404040"/>
               <w:bottom w:val="single" w:sz="8" w:space="0" w:color="404040"/>
               <w:left w:val="single" w:sz="8" w:space="0" w:color="404040"/>
               <w:right w:val="single" w:sz="8" w:space="0" w:color="404040"/>
             </w:tcBorders>
+            <w:tcMar>
+              <w:top w:w="80" w:type="dxa"/>
+              <w:bottom w:w="80" w:type="dxa"/>
+              <w:left w:w="80" w:type="dxa"/>
+              <w:right w:w="80" w:type="dxa"/>
+            </w:tcMar>
           </w:tcPr>
           <w:p>
             <w:pPr>
@@ -2147,19 +2213,19 @@
         </w:tc>
         <w:tc>
           <w:tcPr>
-            <w:tcW w:type="dxa" w:w="3024"/>
-            <w:tcMar>
-              <w:top w:w="57" w:type="dxa"/>
-              <w:bottom w:w="57" w:type="dxa"/>
-              <w:left w:w="57" w:type="dxa"/>
-              <w:right w:w="57" w:type="dxa"/>
-            </w:tcMar>
+            <w:tcW w:type="dxa" w:w="5127"/>
             <w:tcBorders>
               <w:top w:val="single" w:sz="8" w:space="0" w:color="404040"/>
               <w:bottom w:val="single" w:sz="8" w:space="0" w:color="404040"/>
               <w:left w:val="single" w:sz="8" w:space="0" w:color="404040"/>
               <w:right w:val="single" w:sz="8" w:space="0" w:color="404040"/>
             </w:tcBorders>
+            <w:tcMar>
+              <w:top w:w="80" w:type="dxa"/>
+              <w:bottom w:w="80" w:type="dxa"/>
+              <w:left w:w="80" w:type="dxa"/>
+              <w:right w:w="80" w:type="dxa"/>
+            </w:tcMar>
           </w:tcPr>
           <w:p>
             <w:pPr>
@@ -2187,13 +2253,18 @@
     <w:p>
       <w:pPr>
         <w:pStyle w:val="Heading2"/>
+        <w:keepNext w:val="true"/>
+        <w:spacing w:before="120"/>
       </w:pPr>
       <w:r>
         <w:t>Part 3: Peer review (15 minutes)</w:t>
       </w:r>
     </w:p>
     <w:p>
-      <w:pPr/>
+      <w:pPr>
+        <w:keepNext w:val="true"/>
+        <w:spacing w:after="120"/>
+      </w:pPr>
       <w:r>
         <w:rPr>
           <w:color w:val="30302F"/>
@@ -2203,10 +2274,10 @@
     </w:p>
     <w:tbl>
       <w:tblPr>
-        <w:tblW w:type="auto" w:w="0"/>
         <w:jc w:val="center"/>
-        <w:tblLayout w:type="autofit"/>
         <w:tblLook w:firstColumn="1" w:firstRow="1" w:lastColumn="0" w:lastRow="0" w:noHBand="0" w:noVBand="1" w:val="04A0"/>
+        <w:tblW w:w="5000" w:type="pct"/>
+        <w:tblLayout w:type="fixed"/>
       </w:tblPr>
       <w:tblGrid>
         <w:gridCol w:w="1512"/>
@@ -2217,15 +2288,12 @@
         <w:gridCol w:w="1512"/>
       </w:tblGrid>
       <w:tr>
+        <w:trPr>
+          <w:cantSplit w:val="true"/>
+        </w:trPr>
         <w:tc>
           <w:tcPr>
-            <w:tcW w:type="dxa" w:w="1512"/>
-            <w:tcMar>
-              <w:top w:w="57" w:type="dxa"/>
-              <w:bottom w:w="57" w:type="dxa"/>
-              <w:left w:w="57" w:type="dxa"/>
-              <w:right w:w="57" w:type="dxa"/>
-            </w:tcMar>
+            <w:tcW w:type="dxa" w:w="850"/>
             <w:tcBorders>
               <w:top w:val="single" w:sz="8" w:space="0" w:color="404040"/>
               <w:bottom w:val="single" w:sz="8" w:space="0" w:color="404040"/>
@@ -2233,10 +2301,17 @@
               <w:right w:val="single" w:sz="8" w:space="0" w:color="404040"/>
             </w:tcBorders>
             <w:shd w:fill="0A5455" w:val="clear"/>
+            <w:tcMar>
+              <w:top w:w="80" w:type="dxa"/>
+              <w:bottom w:w="80" w:type="dxa"/>
+              <w:left w:w="80" w:type="dxa"/>
+              <w:right w:w="80" w:type="dxa"/>
+            </w:tcMar>
           </w:tcPr>
           <w:p>
             <w:pPr>
               <w:spacing w:before="80" w:after="80"/>
+              <w:keepNext w:val="true"/>
             </w:pPr>
             <w:r>
               <w:rPr>
@@ -2259,13 +2334,7 @@
         </w:tc>
         <w:tc>
           <w:tcPr>
-            <w:tcW w:type="dxa" w:w="1512"/>
-            <w:tcMar>
-              <w:top w:w="57" w:type="dxa"/>
-              <w:bottom w:w="57" w:type="dxa"/>
-              <w:left w:w="57" w:type="dxa"/>
-              <w:right w:w="57" w:type="dxa"/>
-            </w:tcMar>
+            <w:tcW w:type="dxa" w:w="4961"/>
             <w:tcBorders>
               <w:top w:val="single" w:sz="8" w:space="0" w:color="404040"/>
               <w:bottom w:val="single" w:sz="8" w:space="0" w:color="404040"/>
@@ -2273,10 +2342,17 @@
               <w:right w:val="single" w:sz="8" w:space="0" w:color="404040"/>
             </w:tcBorders>
             <w:shd w:fill="3B9C7B" w:val="clear"/>
+            <w:tcMar>
+              <w:top w:w="80" w:type="dxa"/>
+              <w:bottom w:w="80" w:type="dxa"/>
+              <w:left w:w="80" w:type="dxa"/>
+              <w:right w:w="80" w:type="dxa"/>
+            </w:tcMar>
           </w:tcPr>
           <w:p>
             <w:pPr>
               <w:spacing w:before="80" w:after="80"/>
+              <w:keepNext w:val="true"/>
             </w:pPr>
             <w:r>
               <w:rPr>
@@ -2299,13 +2375,7 @@
         </w:tc>
         <w:tc>
           <w:tcPr>
-            <w:tcW w:type="dxa" w:w="1512"/>
-            <w:tcMar>
-              <w:top w:w="57" w:type="dxa"/>
-              <w:bottom w:w="57" w:type="dxa"/>
-              <w:left w:w="57" w:type="dxa"/>
-              <w:right w:w="57" w:type="dxa"/>
-            </w:tcMar>
+            <w:tcW w:type="dxa" w:w="850"/>
             <w:tcBorders>
               <w:top w:val="single" w:sz="8" w:space="0" w:color="404040"/>
               <w:bottom w:val="single" w:sz="8" w:space="0" w:color="404040"/>
@@ -2313,10 +2383,17 @@
               <w:right w:val="single" w:sz="8" w:space="0" w:color="404040"/>
             </w:tcBorders>
             <w:shd w:fill="3B9C7B" w:val="clear"/>
+            <w:tcMar>
+              <w:top w:w="80" w:type="dxa"/>
+              <w:bottom w:w="80" w:type="dxa"/>
+              <w:left w:w="80" w:type="dxa"/>
+              <w:right w:w="80" w:type="dxa"/>
+            </w:tcMar>
           </w:tcPr>
           <w:p>
             <w:pPr>
               <w:spacing w:before="80" w:after="80"/>
+              <w:keepNext w:val="true"/>
             </w:pPr>
             <w:r>
               <w:rPr>
@@ -2339,13 +2416,7 @@
         </w:tc>
         <w:tc>
           <w:tcPr>
-            <w:tcW w:type="dxa" w:w="1512"/>
-            <w:tcMar>
-              <w:top w:w="57" w:type="dxa"/>
-              <w:bottom w:w="57" w:type="dxa"/>
-              <w:left w:w="57" w:type="dxa"/>
-              <w:right w:w="57" w:type="dxa"/>
-            </w:tcMar>
+            <w:tcW w:type="dxa" w:w="1063"/>
             <w:tcBorders>
               <w:top w:val="single" w:sz="8" w:space="0" w:color="404040"/>
               <w:bottom w:val="single" w:sz="8" w:space="0" w:color="404040"/>
@@ -2353,10 +2424,17 @@
               <w:right w:val="single" w:sz="8" w:space="0" w:color="404040"/>
             </w:tcBorders>
             <w:shd w:fill="3B9C7B" w:val="clear"/>
+            <w:tcMar>
+              <w:top w:w="80" w:type="dxa"/>
+              <w:bottom w:w="80" w:type="dxa"/>
+              <w:left w:w="80" w:type="dxa"/>
+              <w:right w:w="80" w:type="dxa"/>
+            </w:tcMar>
           </w:tcPr>
           <w:p>
             <w:pPr>
               <w:spacing w:before="80" w:after="80"/>
+              <w:keepNext w:val="true"/>
             </w:pPr>
             <w:r>
               <w:rPr>
@@ -2379,13 +2457,7 @@
         </w:tc>
         <w:tc>
           <w:tcPr>
-            <w:tcW w:type="dxa" w:w="1512"/>
-            <w:tcMar>
-              <w:top w:w="57" w:type="dxa"/>
-              <w:bottom w:w="57" w:type="dxa"/>
-              <w:left w:w="57" w:type="dxa"/>
-              <w:right w:w="57" w:type="dxa"/>
-            </w:tcMar>
+            <w:tcW w:type="dxa" w:w="850"/>
             <w:tcBorders>
               <w:top w:val="single" w:sz="8" w:space="0" w:color="404040"/>
               <w:bottom w:val="single" w:sz="8" w:space="0" w:color="404040"/>
@@ -2393,10 +2465,17 @@
               <w:right w:val="single" w:sz="8" w:space="0" w:color="404040"/>
             </w:tcBorders>
             <w:shd w:fill="3B9C7B" w:val="clear"/>
+            <w:tcMar>
+              <w:top w:w="80" w:type="dxa"/>
+              <w:bottom w:w="80" w:type="dxa"/>
+              <w:left w:w="80" w:type="dxa"/>
+              <w:right w:w="80" w:type="dxa"/>
+            </w:tcMar>
           </w:tcPr>
           <w:p>
             <w:pPr>
               <w:spacing w:before="80" w:after="80"/>
+              <w:keepNext w:val="true"/>
             </w:pPr>
             <w:r>
               <w:rPr>
@@ -2419,13 +2498,7 @@
         </w:tc>
         <w:tc>
           <w:tcPr>
-            <w:tcW w:type="dxa" w:w="1512"/>
-            <w:tcMar>
-              <w:top w:w="57" w:type="dxa"/>
-              <w:bottom w:w="57" w:type="dxa"/>
-              <w:left w:w="57" w:type="dxa"/>
-              <w:right w:w="57" w:type="dxa"/>
-            </w:tcMar>
+            <w:tcW w:type="dxa" w:w="1063"/>
             <w:tcBorders>
               <w:top w:val="single" w:sz="8" w:space="0" w:color="404040"/>
               <w:bottom w:val="single" w:sz="8" w:space="0" w:color="404040"/>
@@ -2433,10 +2506,17 @@
               <w:right w:val="single" w:sz="8" w:space="0" w:color="404040"/>
             </w:tcBorders>
             <w:shd w:fill="3B9C7B" w:val="clear"/>
+            <w:tcMar>
+              <w:top w:w="80" w:type="dxa"/>
+              <w:bottom w:w="80" w:type="dxa"/>
+              <w:left w:w="80" w:type="dxa"/>
+              <w:right w:w="80" w:type="dxa"/>
+            </w:tcMar>
           </w:tcPr>
           <w:p>
             <w:pPr>
               <w:spacing w:before="80" w:after="80"/>
+              <w:keepNext w:val="true"/>
             </w:pPr>
             <w:r>
               <w:rPr>
@@ -2459,15 +2539,12 @@
         </w:tc>
       </w:tr>
       <w:tr>
+        <w:trPr>
+          <w:cantSplit w:val="true"/>
+        </w:trPr>
         <w:tc>
           <w:tcPr>
-            <w:tcW w:type="dxa" w:w="1512"/>
-            <w:tcMar>
-              <w:top w:w="57" w:type="dxa"/>
-              <w:bottom w:w="57" w:type="dxa"/>
-              <w:left w:w="57" w:type="dxa"/>
-              <w:right w:w="57" w:type="dxa"/>
-            </w:tcMar>
+            <w:tcW w:type="dxa" w:w="850"/>
             <w:tcBorders>
               <w:top w:val="single" w:sz="8" w:space="0" w:color="404040"/>
               <w:bottom w:val="single" w:sz="8" w:space="0" w:color="404040"/>
@@ -2475,10 +2552,17 @@
               <w:right w:val="single" w:sz="8" w:space="0" w:color="404040"/>
             </w:tcBorders>
             <w:shd w:fill="0A5455" w:val="clear"/>
+            <w:tcMar>
+              <w:top w:w="80" w:type="dxa"/>
+              <w:bottom w:w="80" w:type="dxa"/>
+              <w:left w:w="80" w:type="dxa"/>
+              <w:right w:w="80" w:type="dxa"/>
+            </w:tcMar>
           </w:tcPr>
           <w:p>
             <w:pPr>
               <w:spacing w:before="80" w:after="80"/>
+              <w:keepNext w:val="true"/>
             </w:pPr>
             <w:r>
               <w:rPr>
@@ -2501,23 +2585,24 @@
         </w:tc>
         <w:tc>
           <w:tcPr>
-            <w:tcW w:type="dxa" w:w="1512"/>
-            <w:tcMar>
-              <w:top w:w="57" w:type="dxa"/>
-              <w:bottom w:w="57" w:type="dxa"/>
-              <w:left w:w="57" w:type="dxa"/>
-              <w:right w:w="57" w:type="dxa"/>
-            </w:tcMar>
+            <w:tcW w:type="dxa" w:w="4961"/>
             <w:tcBorders>
               <w:top w:val="single" w:sz="8" w:space="0" w:color="404040"/>
               <w:bottom w:val="single" w:sz="8" w:space="0" w:color="404040"/>
               <w:left w:val="single" w:sz="8" w:space="0" w:color="404040"/>
               <w:right w:val="single" w:sz="8" w:space="0" w:color="404040"/>
             </w:tcBorders>
+            <w:tcMar>
+              <w:top w:w="80" w:type="dxa"/>
+              <w:bottom w:w="80" w:type="dxa"/>
+              <w:left w:w="80" w:type="dxa"/>
+              <w:right w:w="80" w:type="dxa"/>
+            </w:tcMar>
           </w:tcPr>
           <w:p>
             <w:pPr>
               <w:spacing w:before="80" w:after="80"/>
+              <w:keepNext w:val="true"/>
             </w:pPr>
             <w:r>
               <w:rPr>
@@ -2538,23 +2623,24 @@
         </w:tc>
         <w:tc>
           <w:tcPr>
-            <w:tcW w:type="dxa" w:w="1512"/>
-            <w:tcMar>
-              <w:top w:w="57" w:type="dxa"/>
-              <w:bottom w:w="57" w:type="dxa"/>
-              <w:left w:w="57" w:type="dxa"/>
-              <w:right w:w="57" w:type="dxa"/>
-            </w:tcMar>
+            <w:tcW w:type="dxa" w:w="850"/>
             <w:tcBorders>
               <w:top w:val="single" w:sz="8" w:space="0" w:color="404040"/>
               <w:bottom w:val="single" w:sz="8" w:space="0" w:color="404040"/>
               <w:left w:val="single" w:sz="8" w:space="0" w:color="404040"/>
               <w:right w:val="single" w:sz="8" w:space="0" w:color="404040"/>
             </w:tcBorders>
+            <w:tcMar>
+              <w:top w:w="80" w:type="dxa"/>
+              <w:bottom w:w="80" w:type="dxa"/>
+              <w:left w:w="80" w:type="dxa"/>
+              <w:right w:w="80" w:type="dxa"/>
+            </w:tcMar>
           </w:tcPr>
           <w:p>
             <w:pPr>
               <w:spacing w:before="80" w:after="80"/>
+              <w:keepNext w:val="true"/>
             </w:pPr>
             <w:r>
               <w:rPr>
@@ -2574,23 +2660,24 @@
         </w:tc>
         <w:tc>
           <w:tcPr>
-            <w:tcW w:type="dxa" w:w="1512"/>
-            <w:tcMar>
-              <w:top w:w="57" w:type="dxa"/>
-              <w:bottom w:w="57" w:type="dxa"/>
-              <w:left w:w="57" w:type="dxa"/>
-              <w:right w:w="57" w:type="dxa"/>
-            </w:tcMar>
+            <w:tcW w:type="dxa" w:w="1063"/>
             <w:tcBorders>
               <w:top w:val="single" w:sz="8" w:space="0" w:color="404040"/>
               <w:bottom w:val="single" w:sz="8" w:space="0" w:color="404040"/>
               <w:left w:val="single" w:sz="8" w:space="0" w:color="404040"/>
               <w:right w:val="single" w:sz="8" w:space="0" w:color="404040"/>
             </w:tcBorders>
+            <w:tcMar>
+              <w:top w:w="80" w:type="dxa"/>
+              <w:bottom w:w="80" w:type="dxa"/>
+              <w:left w:w="80" w:type="dxa"/>
+              <w:right w:w="80" w:type="dxa"/>
+            </w:tcMar>
           </w:tcPr>
           <w:p>
             <w:pPr>
               <w:spacing w:before="80" w:after="80"/>
+              <w:keepNext w:val="true"/>
             </w:pPr>
             <w:r>
               <w:rPr>
@@ -2610,23 +2697,24 @@
         </w:tc>
         <w:tc>
           <w:tcPr>
-            <w:tcW w:type="dxa" w:w="1512"/>
-            <w:tcMar>
-              <w:top w:w="57" w:type="dxa"/>
-              <w:bottom w:w="57" w:type="dxa"/>
-              <w:left w:w="57" w:type="dxa"/>
-              <w:right w:w="57" w:type="dxa"/>
-            </w:tcMar>
+            <w:tcW w:type="dxa" w:w="850"/>
             <w:tcBorders>
               <w:top w:val="single" w:sz="8" w:space="0" w:color="404040"/>
               <w:bottom w:val="single" w:sz="8" w:space="0" w:color="404040"/>
               <w:left w:val="single" w:sz="8" w:space="0" w:color="404040"/>
               <w:right w:val="single" w:sz="8" w:space="0" w:color="404040"/>
             </w:tcBorders>
+            <w:tcMar>
+              <w:top w:w="80" w:type="dxa"/>
+              <w:bottom w:w="80" w:type="dxa"/>
+              <w:left w:w="80" w:type="dxa"/>
+              <w:right w:w="80" w:type="dxa"/>
+            </w:tcMar>
           </w:tcPr>
           <w:p>
             <w:pPr>
               <w:spacing w:before="80" w:after="80"/>
+              <w:keepNext w:val="true"/>
             </w:pPr>
             <w:r>
               <w:rPr>
@@ -2646,23 +2734,24 @@
         </w:tc>
         <w:tc>
           <w:tcPr>
-            <w:tcW w:type="dxa" w:w="1512"/>
-            <w:tcMar>
-              <w:top w:w="57" w:type="dxa"/>
-              <w:bottom w:w="57" w:type="dxa"/>
-              <w:left w:w="57" w:type="dxa"/>
-              <w:right w:w="57" w:type="dxa"/>
-            </w:tcMar>
+            <w:tcW w:type="dxa" w:w="1063"/>
             <w:tcBorders>
               <w:top w:val="single" w:sz="8" w:space="0" w:color="404040"/>
               <w:bottom w:val="single" w:sz="8" w:space="0" w:color="404040"/>
               <w:left w:val="single" w:sz="8" w:space="0" w:color="404040"/>
               <w:right w:val="single" w:sz="8" w:space="0" w:color="404040"/>
             </w:tcBorders>
+            <w:tcMar>
+              <w:top w:w="80" w:type="dxa"/>
+              <w:bottom w:w="80" w:type="dxa"/>
+              <w:left w:w="80" w:type="dxa"/>
+              <w:right w:w="80" w:type="dxa"/>
+            </w:tcMar>
           </w:tcPr>
           <w:p>
             <w:pPr>
               <w:spacing w:before="80" w:after="80"/>
+              <w:keepNext w:val="true"/>
             </w:pPr>
             <w:r>
               <w:rPr>
@@ -2682,15 +2771,12 @@
         </w:tc>
       </w:tr>
       <w:tr>
+        <w:trPr>
+          <w:cantSplit w:val="true"/>
+        </w:trPr>
         <w:tc>
           <w:tcPr>
-            <w:tcW w:type="dxa" w:w="1512"/>
-            <w:tcMar>
-              <w:top w:w="57" w:type="dxa"/>
-              <w:bottom w:w="57" w:type="dxa"/>
-              <w:left w:w="57" w:type="dxa"/>
-              <w:right w:w="57" w:type="dxa"/>
-            </w:tcMar>
+            <w:tcW w:type="dxa" w:w="850"/>
             <w:tcBorders>
               <w:top w:val="single" w:sz="8" w:space="0" w:color="404040"/>
               <w:bottom w:val="single" w:sz="8" w:space="0" w:color="404040"/>
@@ -2698,10 +2784,17 @@
               <w:right w:val="single" w:sz="8" w:space="0" w:color="404040"/>
             </w:tcBorders>
             <w:shd w:fill="0A5455" w:val="clear"/>
+            <w:tcMar>
+              <w:top w:w="80" w:type="dxa"/>
+              <w:bottom w:w="80" w:type="dxa"/>
+              <w:left w:w="80" w:type="dxa"/>
+              <w:right w:w="80" w:type="dxa"/>
+            </w:tcMar>
           </w:tcPr>
           <w:p>
             <w:pPr>
               <w:spacing w:before="80" w:after="80"/>
+              <w:keepNext w:val="true"/>
             </w:pPr>
             <w:r>
               <w:rPr>
@@ -2724,23 +2817,24 @@
         </w:tc>
         <w:tc>
           <w:tcPr>
-            <w:tcW w:type="dxa" w:w="1512"/>
-            <w:tcMar>
-              <w:top w:w="57" w:type="dxa"/>
-              <w:bottom w:w="57" w:type="dxa"/>
-              <w:left w:w="57" w:type="dxa"/>
-              <w:right w:w="57" w:type="dxa"/>
-            </w:tcMar>
+            <w:tcW w:type="dxa" w:w="4961"/>
             <w:tcBorders>
               <w:top w:val="single" w:sz="8" w:space="0" w:color="404040"/>
               <w:bottom w:val="single" w:sz="8" w:space="0" w:color="404040"/>
               <w:left w:val="single" w:sz="8" w:space="0" w:color="404040"/>
               <w:right w:val="single" w:sz="8" w:space="0" w:color="404040"/>
             </w:tcBorders>
+            <w:tcMar>
+              <w:top w:w="80" w:type="dxa"/>
+              <w:bottom w:w="80" w:type="dxa"/>
+              <w:left w:w="80" w:type="dxa"/>
+              <w:right w:w="80" w:type="dxa"/>
+            </w:tcMar>
           </w:tcPr>
           <w:p>
             <w:pPr>
               <w:spacing w:before="80" w:after="80"/>
+              <w:keepNext w:val="true"/>
             </w:pPr>
             <w:r>
               <w:rPr>
@@ -2761,23 +2855,24 @@
         </w:tc>
         <w:tc>
           <w:tcPr>
-            <w:tcW w:type="dxa" w:w="1512"/>
-            <w:tcMar>
-              <w:top w:w="57" w:type="dxa"/>
-              <w:bottom w:w="57" w:type="dxa"/>
-              <w:left w:w="57" w:type="dxa"/>
-              <w:right w:w="57" w:type="dxa"/>
-            </w:tcMar>
+            <w:tcW w:type="dxa" w:w="850"/>
             <w:tcBorders>
               <w:top w:val="single" w:sz="8" w:space="0" w:color="404040"/>
               <w:bottom w:val="single" w:sz="8" w:space="0" w:color="404040"/>
               <w:left w:val="single" w:sz="8" w:space="0" w:color="404040"/>
               <w:right w:val="single" w:sz="8" w:space="0" w:color="404040"/>
             </w:tcBorders>
+            <w:tcMar>
+              <w:top w:w="80" w:type="dxa"/>
+              <w:bottom w:w="80" w:type="dxa"/>
+              <w:left w:w="80" w:type="dxa"/>
+              <w:right w:w="80" w:type="dxa"/>
+            </w:tcMar>
           </w:tcPr>
           <w:p>
             <w:pPr>
               <w:spacing w:before="80" w:after="80"/>
+              <w:keepNext w:val="true"/>
             </w:pPr>
             <w:r>
               <w:rPr>
@@ -2797,23 +2892,24 @@
         </w:tc>
         <w:tc>
           <w:tcPr>
-            <w:tcW w:type="dxa" w:w="1512"/>
-            <w:tcMar>
-              <w:top w:w="57" w:type="dxa"/>
-              <w:bottom w:w="57" w:type="dxa"/>
-              <w:left w:w="57" w:type="dxa"/>
-              <w:right w:w="57" w:type="dxa"/>
-            </w:tcMar>
+            <w:tcW w:type="dxa" w:w="1063"/>
             <w:tcBorders>
               <w:top w:val="single" w:sz="8" w:space="0" w:color="404040"/>
               <w:bottom w:val="single" w:sz="8" w:space="0" w:color="404040"/>
               <w:left w:val="single" w:sz="8" w:space="0" w:color="404040"/>
               <w:right w:val="single" w:sz="8" w:space="0" w:color="404040"/>
             </w:tcBorders>
+            <w:tcMar>
+              <w:top w:w="80" w:type="dxa"/>
+              <w:bottom w:w="80" w:type="dxa"/>
+              <w:left w:w="80" w:type="dxa"/>
+              <w:right w:w="80" w:type="dxa"/>
+            </w:tcMar>
           </w:tcPr>
           <w:p>
             <w:pPr>
               <w:spacing w:before="80" w:after="80"/>
+              <w:keepNext w:val="true"/>
             </w:pPr>
             <w:r>
               <w:rPr>
@@ -2833,23 +2929,24 @@
         </w:tc>
         <w:tc>
           <w:tcPr>
-            <w:tcW w:type="dxa" w:w="1512"/>
-            <w:tcMar>
-              <w:top w:w="57" w:type="dxa"/>
-              <w:bottom w:w="57" w:type="dxa"/>
-              <w:left w:w="57" w:type="dxa"/>
-              <w:right w:w="57" w:type="dxa"/>
-            </w:tcMar>
+            <w:tcW w:type="dxa" w:w="850"/>
             <w:tcBorders>
               <w:top w:val="single" w:sz="8" w:space="0" w:color="404040"/>
               <w:bottom w:val="single" w:sz="8" w:space="0" w:color="404040"/>
               <w:left w:val="single" w:sz="8" w:space="0" w:color="404040"/>
               <w:right w:val="single" w:sz="8" w:space="0" w:color="404040"/>
             </w:tcBorders>
+            <w:tcMar>
+              <w:top w:w="80" w:type="dxa"/>
+              <w:bottom w:w="80" w:type="dxa"/>
+              <w:left w:w="80" w:type="dxa"/>
+              <w:right w:w="80" w:type="dxa"/>
+            </w:tcMar>
           </w:tcPr>
           <w:p>
             <w:pPr>
               <w:spacing w:before="80" w:after="80"/>
+              <w:keepNext w:val="true"/>
             </w:pPr>
             <w:r>
               <w:rPr>
@@ -2869,23 +2966,24 @@
         </w:tc>
         <w:tc>
           <w:tcPr>
-            <w:tcW w:type="dxa" w:w="1512"/>
-            <w:tcMar>
-              <w:top w:w="57" w:type="dxa"/>
-              <w:bottom w:w="57" w:type="dxa"/>
-              <w:left w:w="57" w:type="dxa"/>
-              <w:right w:w="57" w:type="dxa"/>
-            </w:tcMar>
+            <w:tcW w:type="dxa" w:w="1063"/>
             <w:tcBorders>
               <w:top w:val="single" w:sz="8" w:space="0" w:color="404040"/>
               <w:bottom w:val="single" w:sz="8" w:space="0" w:color="404040"/>
               <w:left w:val="single" w:sz="8" w:space="0" w:color="404040"/>
               <w:right w:val="single" w:sz="8" w:space="0" w:color="404040"/>
             </w:tcBorders>
+            <w:tcMar>
+              <w:top w:w="80" w:type="dxa"/>
+              <w:bottom w:w="80" w:type="dxa"/>
+              <w:left w:w="80" w:type="dxa"/>
+              <w:right w:w="80" w:type="dxa"/>
+            </w:tcMar>
           </w:tcPr>
           <w:p>
             <w:pPr>
               <w:spacing w:before="80" w:after="80"/>
+              <w:keepNext w:val="true"/>
             </w:pPr>
             <w:r>
               <w:rPr>
@@ -2905,15 +3003,12 @@
         </w:tc>
       </w:tr>
       <w:tr>
+        <w:trPr>
+          <w:cantSplit w:val="true"/>
+        </w:trPr>
         <w:tc>
           <w:tcPr>
-            <w:tcW w:type="dxa" w:w="1512"/>
-            <w:tcMar>
-              <w:top w:w="57" w:type="dxa"/>
-              <w:bottom w:w="57" w:type="dxa"/>
-              <w:left w:w="57" w:type="dxa"/>
-              <w:right w:w="57" w:type="dxa"/>
-            </w:tcMar>
+            <w:tcW w:type="dxa" w:w="850"/>
             <w:tcBorders>
               <w:top w:val="single" w:sz="8" w:space="0" w:color="404040"/>
               <w:bottom w:val="single" w:sz="8" w:space="0" w:color="404040"/>
@@ -2921,6 +3016,12 @@
               <w:right w:val="single" w:sz="8" w:space="0" w:color="404040"/>
             </w:tcBorders>
             <w:shd w:fill="0A5455" w:val="clear"/>
+            <w:tcMar>
+              <w:top w:w="80" w:type="dxa"/>
+              <w:bottom w:w="80" w:type="dxa"/>
+              <w:left w:w="80" w:type="dxa"/>
+              <w:right w:w="80" w:type="dxa"/>
+            </w:tcMar>
           </w:tcPr>
           <w:p>
             <w:pPr>
@@ -2947,19 +3048,19 @@
         </w:tc>
         <w:tc>
           <w:tcPr>
-            <w:tcW w:type="dxa" w:w="1512"/>
-            <w:tcMar>
-              <w:top w:w="57" w:type="dxa"/>
-              <w:bottom w:w="57" w:type="dxa"/>
-              <w:left w:w="57" w:type="dxa"/>
-              <w:right w:w="57" w:type="dxa"/>
-            </w:tcMar>
+            <w:tcW w:type="dxa" w:w="4961"/>
             <w:tcBorders>
               <w:top w:val="single" w:sz="8" w:space="0" w:color="404040"/>
               <w:bottom w:val="single" w:sz="8" w:space="0" w:color="404040"/>
               <w:left w:val="single" w:sz="8" w:space="0" w:color="404040"/>
               <w:right w:val="single" w:sz="8" w:space="0" w:color="404040"/>
             </w:tcBorders>
+            <w:tcMar>
+              <w:top w:w="80" w:type="dxa"/>
+              <w:bottom w:w="80" w:type="dxa"/>
+              <w:left w:w="80" w:type="dxa"/>
+              <w:right w:w="80" w:type="dxa"/>
+            </w:tcMar>
           </w:tcPr>
           <w:p>
             <w:pPr>
@@ -2984,19 +3085,19 @@
         </w:tc>
         <w:tc>
           <w:tcPr>
-            <w:tcW w:type="dxa" w:w="1512"/>
-            <w:tcMar>
-              <w:top w:w="57" w:type="dxa"/>
-              <w:bottom w:w="57" w:type="dxa"/>
-              <w:left w:w="57" w:type="dxa"/>
-              <w:right w:w="57" w:type="dxa"/>
-            </w:tcMar>
+            <w:tcW w:type="dxa" w:w="850"/>
             <w:tcBorders>
               <w:top w:val="single" w:sz="8" w:space="0" w:color="404040"/>
               <w:bottom w:val="single" w:sz="8" w:space="0" w:color="404040"/>
               <w:left w:val="single" w:sz="8" w:space="0" w:color="404040"/>
               <w:right w:val="single" w:sz="8" w:space="0" w:color="404040"/>
             </w:tcBorders>
+            <w:tcMar>
+              <w:top w:w="80" w:type="dxa"/>
+              <w:bottom w:w="80" w:type="dxa"/>
+              <w:left w:w="80" w:type="dxa"/>
+              <w:right w:w="80" w:type="dxa"/>
+            </w:tcMar>
           </w:tcPr>
           <w:p>
             <w:pPr>
@@ -3020,19 +3121,19 @@
         </w:tc>
         <w:tc>
           <w:tcPr>
-            <w:tcW w:type="dxa" w:w="1512"/>
-            <w:tcMar>
-              <w:top w:w="57" w:type="dxa"/>
-              <w:bottom w:w="57" w:type="dxa"/>
-              <w:left w:w="57" w:type="dxa"/>
-              <w:right w:w="57" w:type="dxa"/>
-            </w:tcMar>
+            <w:tcW w:type="dxa" w:w="1063"/>
             <w:tcBorders>
               <w:top w:val="single" w:sz="8" w:space="0" w:color="404040"/>
               <w:bottom w:val="single" w:sz="8" w:space="0" w:color="404040"/>
               <w:left w:val="single" w:sz="8" w:space="0" w:color="404040"/>
               <w:right w:val="single" w:sz="8" w:space="0" w:color="404040"/>
             </w:tcBorders>
+            <w:tcMar>
+              <w:top w:w="80" w:type="dxa"/>
+              <w:bottom w:w="80" w:type="dxa"/>
+              <w:left w:w="80" w:type="dxa"/>
+              <w:right w:w="80" w:type="dxa"/>
+            </w:tcMar>
           </w:tcPr>
           <w:p>
             <w:pPr>
@@ -3056,19 +3157,19 @@
         </w:tc>
         <w:tc>
           <w:tcPr>
-            <w:tcW w:type="dxa" w:w="1512"/>
-            <w:tcMar>
-              <w:top w:w="57" w:type="dxa"/>
-              <w:bottom w:w="57" w:type="dxa"/>
-              <w:left w:w="57" w:type="dxa"/>
-              <w:right w:w="57" w:type="dxa"/>
-            </w:tcMar>
+            <w:tcW w:type="dxa" w:w="850"/>
             <w:tcBorders>
               <w:top w:val="single" w:sz="8" w:space="0" w:color="404040"/>
               <w:bottom w:val="single" w:sz="8" w:space="0" w:color="404040"/>
               <w:left w:val="single" w:sz="8" w:space="0" w:color="404040"/>
               <w:right w:val="single" w:sz="8" w:space="0" w:color="404040"/>
             </w:tcBorders>
+            <w:tcMar>
+              <w:top w:w="80" w:type="dxa"/>
+              <w:bottom w:w="80" w:type="dxa"/>
+              <w:left w:w="80" w:type="dxa"/>
+              <w:right w:w="80" w:type="dxa"/>
+            </w:tcMar>
           </w:tcPr>
           <w:p>
             <w:pPr>
@@ -3092,19 +3193,19 @@
         </w:tc>
         <w:tc>
           <w:tcPr>
-            <w:tcW w:type="dxa" w:w="1512"/>
-            <w:tcMar>
-              <w:top w:w="57" w:type="dxa"/>
-              <w:bottom w:w="57" w:type="dxa"/>
-              <w:left w:w="57" w:type="dxa"/>
-              <w:right w:w="57" w:type="dxa"/>
-            </w:tcMar>
+            <w:tcW w:type="dxa" w:w="1063"/>
             <w:tcBorders>
               <w:top w:val="single" w:sz="8" w:space="0" w:color="404040"/>
               <w:bottom w:val="single" w:sz="8" w:space="0" w:color="404040"/>
               <w:left w:val="single" w:sz="8" w:space="0" w:color="404040"/>
               <w:right w:val="single" w:sz="8" w:space="0" w:color="404040"/>
             </w:tcBorders>
+            <w:tcMar>
+              <w:top w:w="80" w:type="dxa"/>
+              <w:bottom w:w="80" w:type="dxa"/>
+              <w:left w:w="80" w:type="dxa"/>
+              <w:right w:w="80" w:type="dxa"/>
+            </w:tcMar>
           </w:tcPr>
           <w:p>
             <w:pPr>
@@ -3128,15 +3229,12 @@
         </w:tc>
       </w:tr>
       <w:tr>
+        <w:trPr>
+          <w:cantSplit w:val="true"/>
+        </w:trPr>
         <w:tc>
           <w:tcPr>
-            <w:tcW w:type="dxa" w:w="1512"/>
-            <w:tcMar>
-              <w:top w:w="57" w:type="dxa"/>
-              <w:bottom w:w="57" w:type="dxa"/>
-              <w:left w:w="57" w:type="dxa"/>
-              <w:right w:w="57" w:type="dxa"/>
-            </w:tcMar>
+            <w:tcW w:type="dxa" w:w="850"/>
             <w:tcBorders>
               <w:top w:val="single" w:sz="8" w:space="0" w:color="404040"/>
               <w:bottom w:val="single" w:sz="8" w:space="0" w:color="404040"/>
@@ -3144,6 +3242,12 @@
               <w:right w:val="single" w:sz="8" w:space="0" w:color="404040"/>
             </w:tcBorders>
             <w:shd w:fill="0A5455" w:val="clear"/>
+            <w:tcMar>
+              <w:top w:w="80" w:type="dxa"/>
+              <w:bottom w:w="80" w:type="dxa"/>
+              <w:left w:w="80" w:type="dxa"/>
+              <w:right w:w="80" w:type="dxa"/>
+            </w:tcMar>
           </w:tcPr>
           <w:p>
             <w:pPr>
@@ -3170,19 +3274,19 @@
         </w:tc>
         <w:tc>
           <w:tcPr>
-            <w:tcW w:type="dxa" w:w="1512"/>
-            <w:tcMar>
-              <w:top w:w="57" w:type="dxa"/>
-              <w:bottom w:w="57" w:type="dxa"/>
-              <w:left w:w="57" w:type="dxa"/>
-              <w:right w:w="57" w:type="dxa"/>
-            </w:tcMar>
+            <w:tcW w:type="dxa" w:w="4961"/>
             <w:tcBorders>
               <w:top w:val="single" w:sz="8" w:space="0" w:color="404040"/>
               <w:bottom w:val="single" w:sz="8" w:space="0" w:color="404040"/>
               <w:left w:val="single" w:sz="8" w:space="0" w:color="404040"/>
               <w:right w:val="single" w:sz="8" w:space="0" w:color="404040"/>
             </w:tcBorders>
+            <w:tcMar>
+              <w:top w:w="80" w:type="dxa"/>
+              <w:bottom w:w="80" w:type="dxa"/>
+              <w:left w:w="80" w:type="dxa"/>
+              <w:right w:w="80" w:type="dxa"/>
+            </w:tcMar>
           </w:tcPr>
           <w:p>
             <w:pPr>
@@ -3207,19 +3311,19 @@
         </w:tc>
         <w:tc>
           <w:tcPr>
-            <w:tcW w:type="dxa" w:w="1512"/>
-            <w:tcMar>
-              <w:top w:w="57" w:type="dxa"/>
-              <w:bottom w:w="57" w:type="dxa"/>
-              <w:left w:w="57" w:type="dxa"/>
-              <w:right w:w="57" w:type="dxa"/>
-            </w:tcMar>
+            <w:tcW w:type="dxa" w:w="850"/>
             <w:tcBorders>
               <w:top w:val="single" w:sz="8" w:space="0" w:color="404040"/>
               <w:bottom w:val="single" w:sz="8" w:space="0" w:color="404040"/>
               <w:left w:val="single" w:sz="8" w:space="0" w:color="404040"/>
               <w:right w:val="single" w:sz="8" w:space="0" w:color="404040"/>
             </w:tcBorders>
+            <w:tcMar>
+              <w:top w:w="80" w:type="dxa"/>
+              <w:bottom w:w="80" w:type="dxa"/>
+              <w:left w:w="80" w:type="dxa"/>
+              <w:right w:w="80" w:type="dxa"/>
+            </w:tcMar>
           </w:tcPr>
           <w:p>
             <w:pPr>
@@ -3243,19 +3347,19 @@
         </w:tc>
         <w:tc>
           <w:tcPr>
-            <w:tcW w:type="dxa" w:w="1512"/>
-            <w:tcMar>
-              <w:top w:w="57" w:type="dxa"/>
-              <w:bottom w:w="57" w:type="dxa"/>
-              <w:left w:w="57" w:type="dxa"/>
-              <w:right w:w="57" w:type="dxa"/>
-            </w:tcMar>
+            <w:tcW w:type="dxa" w:w="1063"/>
             <w:tcBorders>
               <w:top w:val="single" w:sz="8" w:space="0" w:color="404040"/>
               <w:bottom w:val="single" w:sz="8" w:space="0" w:color="404040"/>
               <w:left w:val="single" w:sz="8" w:space="0" w:color="404040"/>
               <w:right w:val="single" w:sz="8" w:space="0" w:color="404040"/>
             </w:tcBorders>
+            <w:tcMar>
+              <w:top w:w="80" w:type="dxa"/>
+              <w:bottom w:w="80" w:type="dxa"/>
+              <w:left w:w="80" w:type="dxa"/>
+              <w:right w:w="80" w:type="dxa"/>
+            </w:tcMar>
           </w:tcPr>
           <w:p>
             <w:pPr>
@@ -3279,19 +3383,19 @@
         </w:tc>
         <w:tc>
           <w:tcPr>
-            <w:tcW w:type="dxa" w:w="1512"/>
-            <w:tcMar>
-              <w:top w:w="57" w:type="dxa"/>
-              <w:bottom w:w="57" w:type="dxa"/>
-              <w:left w:w="57" w:type="dxa"/>
-              <w:right w:w="57" w:type="dxa"/>
-            </w:tcMar>
+            <w:tcW w:type="dxa" w:w="850"/>
             <w:tcBorders>
               <w:top w:val="single" w:sz="8" w:space="0" w:color="404040"/>
               <w:bottom w:val="single" w:sz="8" w:space="0" w:color="404040"/>
               <w:left w:val="single" w:sz="8" w:space="0" w:color="404040"/>
               <w:right w:val="single" w:sz="8" w:space="0" w:color="404040"/>
             </w:tcBorders>
+            <w:tcMar>
+              <w:top w:w="80" w:type="dxa"/>
+              <w:bottom w:w="80" w:type="dxa"/>
+              <w:left w:w="80" w:type="dxa"/>
+              <w:right w:w="80" w:type="dxa"/>
+            </w:tcMar>
           </w:tcPr>
           <w:p>
             <w:pPr>
@@ -3315,19 +3419,19 @@
         </w:tc>
         <w:tc>
           <w:tcPr>
-            <w:tcW w:type="dxa" w:w="1512"/>
-            <w:tcMar>
-              <w:top w:w="57" w:type="dxa"/>
-              <w:bottom w:w="57" w:type="dxa"/>
-              <w:left w:w="57" w:type="dxa"/>
-              <w:right w:w="57" w:type="dxa"/>
-            </w:tcMar>
+            <w:tcW w:type="dxa" w:w="1063"/>
             <w:tcBorders>
               <w:top w:val="single" w:sz="8" w:space="0" w:color="404040"/>
               <w:bottom w:val="single" w:sz="8" w:space="0" w:color="404040"/>
               <w:left w:val="single" w:sz="8" w:space="0" w:color="404040"/>
               <w:right w:val="single" w:sz="8" w:space="0" w:color="404040"/>
             </w:tcBorders>
+            <w:tcMar>
+              <w:top w:w="80" w:type="dxa"/>
+              <w:bottom w:w="80" w:type="dxa"/>
+              <w:left w:w="80" w:type="dxa"/>
+              <w:right w:w="80" w:type="dxa"/>
+            </w:tcMar>
           </w:tcPr>
           <w:p>
             <w:pPr>
@@ -3351,15 +3455,12 @@
         </w:tc>
       </w:tr>
       <w:tr>
+        <w:trPr>
+          <w:cantSplit w:val="true"/>
+        </w:trPr>
         <w:tc>
           <w:tcPr>
-            <w:tcW w:type="dxa" w:w="1512"/>
-            <w:tcMar>
-              <w:top w:w="57" w:type="dxa"/>
-              <w:bottom w:w="57" w:type="dxa"/>
-              <w:left w:w="57" w:type="dxa"/>
-              <w:right w:w="57" w:type="dxa"/>
-            </w:tcMar>
+            <w:tcW w:type="dxa" w:w="850"/>
             <w:tcBorders>
               <w:top w:val="single" w:sz="8" w:space="0" w:color="404040"/>
               <w:bottom w:val="single" w:sz="8" w:space="0" w:color="404040"/>
@@ -3367,6 +3468,12 @@
               <w:right w:val="single" w:sz="8" w:space="0" w:color="404040"/>
             </w:tcBorders>
             <w:shd w:fill="0A5455" w:val="clear"/>
+            <w:tcMar>
+              <w:top w:w="80" w:type="dxa"/>
+              <w:bottom w:w="80" w:type="dxa"/>
+              <w:left w:w="80" w:type="dxa"/>
+              <w:right w:w="80" w:type="dxa"/>
+            </w:tcMar>
           </w:tcPr>
           <w:p>
             <w:pPr>
@@ -3393,19 +3500,19 @@
         </w:tc>
         <w:tc>
           <w:tcPr>
-            <w:tcW w:type="dxa" w:w="1512"/>
-            <w:tcMar>
-              <w:top w:w="57" w:type="dxa"/>
-              <w:bottom w:w="57" w:type="dxa"/>
-              <w:left w:w="57" w:type="dxa"/>
-              <w:right w:w="57" w:type="dxa"/>
-            </w:tcMar>
+            <w:tcW w:type="dxa" w:w="4961"/>
             <w:tcBorders>
               <w:top w:val="single" w:sz="8" w:space="0" w:color="404040"/>
               <w:bottom w:val="single" w:sz="8" w:space="0" w:color="404040"/>
               <w:left w:val="single" w:sz="8" w:space="0" w:color="404040"/>
               <w:right w:val="single" w:sz="8" w:space="0" w:color="404040"/>
             </w:tcBorders>
+            <w:tcMar>
+              <w:top w:w="80" w:type="dxa"/>
+              <w:bottom w:w="80" w:type="dxa"/>
+              <w:left w:w="80" w:type="dxa"/>
+              <w:right w:w="80" w:type="dxa"/>
+            </w:tcMar>
           </w:tcPr>
           <w:p>
             <w:pPr>
@@ -3430,19 +3537,19 @@
         </w:tc>
         <w:tc>
           <w:tcPr>
-            <w:tcW w:type="dxa" w:w="1512"/>
-            <w:tcMar>
-              <w:top w:w="57" w:type="dxa"/>
-              <w:bottom w:w="57" w:type="dxa"/>
-              <w:left w:w="57" w:type="dxa"/>
-              <w:right w:w="57" w:type="dxa"/>
-            </w:tcMar>
+            <w:tcW w:type="dxa" w:w="850"/>
             <w:tcBorders>
               <w:top w:val="single" w:sz="8" w:space="0" w:color="404040"/>
               <w:bottom w:val="single" w:sz="8" w:space="0" w:color="404040"/>
               <w:left w:val="single" w:sz="8" w:space="0" w:color="404040"/>
               <w:right w:val="single" w:sz="8" w:space="0" w:color="404040"/>
             </w:tcBorders>
+            <w:tcMar>
+              <w:top w:w="80" w:type="dxa"/>
+              <w:bottom w:w="80" w:type="dxa"/>
+              <w:left w:w="80" w:type="dxa"/>
+              <w:right w:w="80" w:type="dxa"/>
+            </w:tcMar>
           </w:tcPr>
           <w:p>
             <w:pPr>
@@ -3466,19 +3573,19 @@
         </w:tc>
         <w:tc>
           <w:tcPr>
-            <w:tcW w:type="dxa" w:w="1512"/>
-            <w:tcMar>
-              <w:top w:w="57" w:type="dxa"/>
-              <w:bottom w:w="57" w:type="dxa"/>
-              <w:left w:w="57" w:type="dxa"/>
-              <w:right w:w="57" w:type="dxa"/>
-            </w:tcMar>
+            <w:tcW w:type="dxa" w:w="1063"/>
             <w:tcBorders>
               <w:top w:val="single" w:sz="8" w:space="0" w:color="404040"/>
               <w:bottom w:val="single" w:sz="8" w:space="0" w:color="404040"/>
               <w:left w:val="single" w:sz="8" w:space="0" w:color="404040"/>
               <w:right w:val="single" w:sz="8" w:space="0" w:color="404040"/>
             </w:tcBorders>
+            <w:tcMar>
+              <w:top w:w="80" w:type="dxa"/>
+              <w:bottom w:w="80" w:type="dxa"/>
+              <w:left w:w="80" w:type="dxa"/>
+              <w:right w:w="80" w:type="dxa"/>
+            </w:tcMar>
           </w:tcPr>
           <w:p>
             <w:pPr>
@@ -3502,19 +3609,19 @@
         </w:tc>
         <w:tc>
           <w:tcPr>
-            <w:tcW w:type="dxa" w:w="1512"/>
-            <w:tcMar>
-              <w:top w:w="57" w:type="dxa"/>
-              <w:bottom w:w="57" w:type="dxa"/>
-              <w:left w:w="57" w:type="dxa"/>
-              <w:right w:w="57" w:type="dxa"/>
-            </w:tcMar>
+            <w:tcW w:type="dxa" w:w="850"/>
             <w:tcBorders>
               <w:top w:val="single" w:sz="8" w:space="0" w:color="404040"/>
               <w:bottom w:val="single" w:sz="8" w:space="0" w:color="404040"/>
               <w:left w:val="single" w:sz="8" w:space="0" w:color="404040"/>
               <w:right w:val="single" w:sz="8" w:space="0" w:color="404040"/>
             </w:tcBorders>
+            <w:tcMar>
+              <w:top w:w="80" w:type="dxa"/>
+              <w:bottom w:w="80" w:type="dxa"/>
+              <w:left w:w="80" w:type="dxa"/>
+              <w:right w:w="80" w:type="dxa"/>
+            </w:tcMar>
           </w:tcPr>
           <w:p>
             <w:pPr>
@@ -3538,19 +3645,19 @@
         </w:tc>
         <w:tc>
           <w:tcPr>
-            <w:tcW w:type="dxa" w:w="1512"/>
-            <w:tcMar>
-              <w:top w:w="57" w:type="dxa"/>
-              <w:bottom w:w="57" w:type="dxa"/>
-              <w:left w:w="57" w:type="dxa"/>
-              <w:right w:w="57" w:type="dxa"/>
-            </w:tcMar>
+            <w:tcW w:type="dxa" w:w="1063"/>
             <w:tcBorders>
               <w:top w:val="single" w:sz="8" w:space="0" w:color="404040"/>
               <w:bottom w:val="single" w:sz="8" w:space="0" w:color="404040"/>
               <w:left w:val="single" w:sz="8" w:space="0" w:color="404040"/>
               <w:right w:val="single" w:sz="8" w:space="0" w:color="404040"/>
             </w:tcBorders>
+            <w:tcMar>
+              <w:top w:w="80" w:type="dxa"/>
+              <w:bottom w:w="80" w:type="dxa"/>
+              <w:left w:w="80" w:type="dxa"/>
+              <w:right w:w="80" w:type="dxa"/>
+            </w:tcMar>
           </w:tcPr>
           <w:p>
             <w:pPr>
@@ -3574,15 +3681,12 @@
         </w:tc>
       </w:tr>
       <w:tr>
+        <w:trPr>
+          <w:cantSplit w:val="true"/>
+        </w:trPr>
         <w:tc>
           <w:tcPr>
-            <w:tcW w:type="dxa" w:w="1512"/>
-            <w:tcMar>
-              <w:top w:w="57" w:type="dxa"/>
-              <w:bottom w:w="57" w:type="dxa"/>
-              <w:left w:w="57" w:type="dxa"/>
-              <w:right w:w="57" w:type="dxa"/>
-            </w:tcMar>
+            <w:tcW w:type="dxa" w:w="850"/>
             <w:tcBorders>
               <w:top w:val="single" w:sz="8" w:space="0" w:color="404040"/>
               <w:bottom w:val="single" w:sz="8" w:space="0" w:color="404040"/>
@@ -3590,6 +3694,12 @@
               <w:right w:val="single" w:sz="8" w:space="0" w:color="404040"/>
             </w:tcBorders>
             <w:shd w:fill="0A5455" w:val="clear"/>
+            <w:tcMar>
+              <w:top w:w="80" w:type="dxa"/>
+              <w:bottom w:w="80" w:type="dxa"/>
+              <w:left w:w="80" w:type="dxa"/>
+              <w:right w:w="80" w:type="dxa"/>
+            </w:tcMar>
           </w:tcPr>
           <w:p>
             <w:pPr>
@@ -3616,19 +3726,19 @@
         </w:tc>
         <w:tc>
           <w:tcPr>
-            <w:tcW w:type="dxa" w:w="1512"/>
-            <w:tcMar>
-              <w:top w:w="57" w:type="dxa"/>
-              <w:bottom w:w="57" w:type="dxa"/>
-              <w:left w:w="57" w:type="dxa"/>
-              <w:right w:w="57" w:type="dxa"/>
-            </w:tcMar>
+            <w:tcW w:type="dxa" w:w="4961"/>
             <w:tcBorders>
               <w:top w:val="single" w:sz="8" w:space="0" w:color="404040"/>
               <w:bottom w:val="single" w:sz="8" w:space="0" w:color="404040"/>
               <w:left w:val="single" w:sz="8" w:space="0" w:color="404040"/>
               <w:right w:val="single" w:sz="8" w:space="0" w:color="404040"/>
             </w:tcBorders>
+            <w:tcMar>
+              <w:top w:w="80" w:type="dxa"/>
+              <w:bottom w:w="80" w:type="dxa"/>
+              <w:left w:w="80" w:type="dxa"/>
+              <w:right w:w="80" w:type="dxa"/>
+            </w:tcMar>
           </w:tcPr>
           <w:p>
             <w:pPr>
@@ -3653,19 +3763,19 @@
         </w:tc>
         <w:tc>
           <w:tcPr>
-            <w:tcW w:type="dxa" w:w="1512"/>
-            <w:tcMar>
-              <w:top w:w="57" w:type="dxa"/>
-              <w:bottom w:w="57" w:type="dxa"/>
-              <w:left w:w="57" w:type="dxa"/>
-              <w:right w:w="57" w:type="dxa"/>
-            </w:tcMar>
+            <w:tcW w:type="dxa" w:w="850"/>
             <w:tcBorders>
               <w:top w:val="single" w:sz="8" w:space="0" w:color="404040"/>
               <w:bottom w:val="single" w:sz="8" w:space="0" w:color="404040"/>
               <w:left w:val="single" w:sz="8" w:space="0" w:color="404040"/>
               <w:right w:val="single" w:sz="8" w:space="0" w:color="404040"/>
             </w:tcBorders>
+            <w:tcMar>
+              <w:top w:w="80" w:type="dxa"/>
+              <w:bottom w:w="80" w:type="dxa"/>
+              <w:left w:w="80" w:type="dxa"/>
+              <w:right w:w="80" w:type="dxa"/>
+            </w:tcMar>
           </w:tcPr>
           <w:p>
             <w:pPr>
@@ -3689,19 +3799,19 @@
         </w:tc>
         <w:tc>
           <w:tcPr>
-            <w:tcW w:type="dxa" w:w="1512"/>
-            <w:tcMar>
-              <w:top w:w="57" w:type="dxa"/>
-              <w:bottom w:w="57" w:type="dxa"/>
-              <w:left w:w="57" w:type="dxa"/>
-              <w:right w:w="57" w:type="dxa"/>
-            </w:tcMar>
+            <w:tcW w:type="dxa" w:w="1063"/>
             <w:tcBorders>
               <w:top w:val="single" w:sz="8" w:space="0" w:color="404040"/>
               <w:bottom w:val="single" w:sz="8" w:space="0" w:color="404040"/>
               <w:left w:val="single" w:sz="8" w:space="0" w:color="404040"/>
               <w:right w:val="single" w:sz="8" w:space="0" w:color="404040"/>
             </w:tcBorders>
+            <w:tcMar>
+              <w:top w:w="80" w:type="dxa"/>
+              <w:bottom w:w="80" w:type="dxa"/>
+              <w:left w:w="80" w:type="dxa"/>
+              <w:right w:w="80" w:type="dxa"/>
+            </w:tcMar>
           </w:tcPr>
           <w:p>
             <w:pPr>
@@ -3725,19 +3835,19 @@
         </w:tc>
         <w:tc>
           <w:tcPr>
-            <w:tcW w:type="dxa" w:w="1512"/>
-            <w:tcMar>
-              <w:top w:w="57" w:type="dxa"/>
-              <w:bottom w:w="57" w:type="dxa"/>
-              <w:left w:w="57" w:type="dxa"/>
-              <w:right w:w="57" w:type="dxa"/>
-            </w:tcMar>
+            <w:tcW w:type="dxa" w:w="850"/>
             <w:tcBorders>
               <w:top w:val="single" w:sz="8" w:space="0" w:color="404040"/>
               <w:bottom w:val="single" w:sz="8" w:space="0" w:color="404040"/>
               <w:left w:val="single" w:sz="8" w:space="0" w:color="404040"/>
               <w:right w:val="single" w:sz="8" w:space="0" w:color="404040"/>
             </w:tcBorders>
+            <w:tcMar>
+              <w:top w:w="80" w:type="dxa"/>
+              <w:bottom w:w="80" w:type="dxa"/>
+              <w:left w:w="80" w:type="dxa"/>
+              <w:right w:w="80" w:type="dxa"/>
+            </w:tcMar>
           </w:tcPr>
           <w:p>
             <w:pPr>
@@ -3761,19 +3871,19 @@
         </w:tc>
         <w:tc>
           <w:tcPr>
-            <w:tcW w:type="dxa" w:w="1512"/>
-            <w:tcMar>
-              <w:top w:w="57" w:type="dxa"/>
-              <w:bottom w:w="57" w:type="dxa"/>
-              <w:left w:w="57" w:type="dxa"/>
-              <w:right w:w="57" w:type="dxa"/>
-            </w:tcMar>
+            <w:tcW w:type="dxa" w:w="1063"/>
             <w:tcBorders>
               <w:top w:val="single" w:sz="8" w:space="0" w:color="404040"/>
               <w:bottom w:val="single" w:sz="8" w:space="0" w:color="404040"/>
               <w:left w:val="single" w:sz="8" w:space="0" w:color="404040"/>
               <w:right w:val="single" w:sz="8" w:space="0" w:color="404040"/>
             </w:tcBorders>
+            <w:tcMar>
+              <w:top w:w="80" w:type="dxa"/>
+              <w:bottom w:w="80" w:type="dxa"/>
+              <w:left w:w="80" w:type="dxa"/>
+              <w:right w:w="80" w:type="dxa"/>
+            </w:tcMar>
           </w:tcPr>
           <w:p>
             <w:pPr>
@@ -3797,15 +3907,12 @@
         </w:tc>
       </w:tr>
       <w:tr>
+        <w:trPr>
+          <w:cantSplit w:val="true"/>
+        </w:trPr>
         <w:tc>
           <w:tcPr>
-            <w:tcW w:type="dxa" w:w="1512"/>
-            <w:tcMar>
-              <w:top w:w="57" w:type="dxa"/>
-              <w:bottom w:w="57" w:type="dxa"/>
-              <w:left w:w="57" w:type="dxa"/>
-              <w:right w:w="57" w:type="dxa"/>
-            </w:tcMar>
+            <w:tcW w:type="dxa" w:w="850"/>
             <w:tcBorders>
               <w:top w:val="single" w:sz="8" w:space="0" w:color="404040"/>
               <w:bottom w:val="single" w:sz="8" w:space="0" w:color="404040"/>
@@ -3813,6 +3920,12 @@
               <w:right w:val="single" w:sz="8" w:space="0" w:color="404040"/>
             </w:tcBorders>
             <w:shd w:fill="0A5455" w:val="clear"/>
+            <w:tcMar>
+              <w:top w:w="80" w:type="dxa"/>
+              <w:bottom w:w="80" w:type="dxa"/>
+              <w:left w:w="80" w:type="dxa"/>
+              <w:right w:w="80" w:type="dxa"/>
+            </w:tcMar>
           </w:tcPr>
           <w:p>
             <w:pPr>
@@ -3839,19 +3952,19 @@
         </w:tc>
         <w:tc>
           <w:tcPr>
-            <w:tcW w:type="dxa" w:w="1512"/>
-            <w:tcMar>
-              <w:top w:w="57" w:type="dxa"/>
-              <w:bottom w:w="57" w:type="dxa"/>
-              <w:left w:w="57" w:type="dxa"/>
-              <w:right w:w="57" w:type="dxa"/>
-            </w:tcMar>
+            <w:tcW w:type="dxa" w:w="4961"/>
             <w:tcBorders>
               <w:top w:val="single" w:sz="8" w:space="0" w:color="404040"/>
               <w:bottom w:val="single" w:sz="8" w:space="0" w:color="404040"/>
               <w:left w:val="single" w:sz="8" w:space="0" w:color="404040"/>
               <w:right w:val="single" w:sz="8" w:space="0" w:color="404040"/>
             </w:tcBorders>
+            <w:tcMar>
+              <w:top w:w="80" w:type="dxa"/>
+              <w:bottom w:w="80" w:type="dxa"/>
+              <w:left w:w="80" w:type="dxa"/>
+              <w:right w:w="80" w:type="dxa"/>
+            </w:tcMar>
           </w:tcPr>
           <w:p>
             <w:pPr>
@@ -3876,19 +3989,19 @@
         </w:tc>
         <w:tc>
           <w:tcPr>
-            <w:tcW w:type="dxa" w:w="1512"/>
-            <w:tcMar>
-              <w:top w:w="57" w:type="dxa"/>
-              <w:bottom w:w="57" w:type="dxa"/>
-              <w:left w:w="57" w:type="dxa"/>
-              <w:right w:w="57" w:type="dxa"/>
-            </w:tcMar>
+            <w:tcW w:type="dxa" w:w="850"/>
             <w:tcBorders>
               <w:top w:val="single" w:sz="8" w:space="0" w:color="404040"/>
               <w:bottom w:val="single" w:sz="8" w:space="0" w:color="404040"/>
               <w:left w:val="single" w:sz="8" w:space="0" w:color="404040"/>
               <w:right w:val="single" w:sz="8" w:space="0" w:color="404040"/>
             </w:tcBorders>
+            <w:tcMar>
+              <w:top w:w="80" w:type="dxa"/>
+              <w:bottom w:w="80" w:type="dxa"/>
+              <w:left w:w="80" w:type="dxa"/>
+              <w:right w:w="80" w:type="dxa"/>
+            </w:tcMar>
           </w:tcPr>
           <w:p>
             <w:pPr>
@@ -3912,19 +4025,19 @@
         </w:tc>
         <w:tc>
           <w:tcPr>
-            <w:tcW w:type="dxa" w:w="1512"/>
-            <w:tcMar>
-              <w:top w:w="57" w:type="dxa"/>
-              <w:bottom w:w="57" w:type="dxa"/>
-              <w:left w:w="57" w:type="dxa"/>
-              <w:right w:w="57" w:type="dxa"/>
-            </w:tcMar>
+            <w:tcW w:type="dxa" w:w="1063"/>
             <w:tcBorders>
               <w:top w:val="single" w:sz="8" w:space="0" w:color="404040"/>
               <w:bottom w:val="single" w:sz="8" w:space="0" w:color="404040"/>
               <w:left w:val="single" w:sz="8" w:space="0" w:color="404040"/>
               <w:right w:val="single" w:sz="8" w:space="0" w:color="404040"/>
             </w:tcBorders>
+            <w:tcMar>
+              <w:top w:w="80" w:type="dxa"/>
+              <w:bottom w:w="80" w:type="dxa"/>
+              <w:left w:w="80" w:type="dxa"/>
+              <w:right w:w="80" w:type="dxa"/>
+            </w:tcMar>
           </w:tcPr>
           <w:p>
             <w:pPr>
@@ -3948,19 +4061,19 @@
         </w:tc>
         <w:tc>
           <w:tcPr>
-            <w:tcW w:type="dxa" w:w="1512"/>
-            <w:tcMar>
-              <w:top w:w="57" w:type="dxa"/>
-              <w:bottom w:w="57" w:type="dxa"/>
-              <w:left w:w="57" w:type="dxa"/>
-              <w:right w:w="57" w:type="dxa"/>
-            </w:tcMar>
+            <w:tcW w:type="dxa" w:w="850"/>
             <w:tcBorders>
               <w:top w:val="single" w:sz="8" w:space="0" w:color="404040"/>
               <w:bottom w:val="single" w:sz="8" w:space="0" w:color="404040"/>
               <w:left w:val="single" w:sz="8" w:space="0" w:color="404040"/>
               <w:right w:val="single" w:sz="8" w:space="0" w:color="404040"/>
             </w:tcBorders>
+            <w:tcMar>
+              <w:top w:w="80" w:type="dxa"/>
+              <w:bottom w:w="80" w:type="dxa"/>
+              <w:left w:w="80" w:type="dxa"/>
+              <w:right w:w="80" w:type="dxa"/>
+            </w:tcMar>
           </w:tcPr>
           <w:p>
             <w:pPr>
@@ -3984,19 +4097,19 @@
         </w:tc>
         <w:tc>
           <w:tcPr>
-            <w:tcW w:type="dxa" w:w="1512"/>
-            <w:tcMar>
-              <w:top w:w="57" w:type="dxa"/>
-              <w:bottom w:w="57" w:type="dxa"/>
-              <w:left w:w="57" w:type="dxa"/>
-              <w:right w:w="57" w:type="dxa"/>
-            </w:tcMar>
+            <w:tcW w:type="dxa" w:w="1063"/>
             <w:tcBorders>
               <w:top w:val="single" w:sz="8" w:space="0" w:color="404040"/>
               <w:bottom w:val="single" w:sz="8" w:space="0" w:color="404040"/>
               <w:left w:val="single" w:sz="8" w:space="0" w:color="404040"/>
               <w:right w:val="single" w:sz="8" w:space="0" w:color="404040"/>
             </w:tcBorders>
+            <w:tcMar>
+              <w:top w:w="80" w:type="dxa"/>
+              <w:bottom w:w="80" w:type="dxa"/>
+              <w:left w:w="80" w:type="dxa"/>
+              <w:right w:w="80" w:type="dxa"/>
+            </w:tcMar>
           </w:tcPr>
           <w:p>
             <w:pPr>
@@ -4020,15 +4133,12 @@
         </w:tc>
       </w:tr>
       <w:tr>
+        <w:trPr>
+          <w:cantSplit w:val="true"/>
+        </w:trPr>
         <w:tc>
           <w:tcPr>
-            <w:tcW w:type="dxa" w:w="1512"/>
-            <w:tcMar>
-              <w:top w:w="57" w:type="dxa"/>
-              <w:bottom w:w="57" w:type="dxa"/>
-              <w:left w:w="57" w:type="dxa"/>
-              <w:right w:w="57" w:type="dxa"/>
-            </w:tcMar>
+            <w:tcW w:type="dxa" w:w="850"/>
             <w:tcBorders>
               <w:top w:val="single" w:sz="8" w:space="0" w:color="404040"/>
               <w:bottom w:val="single" w:sz="8" w:space="0" w:color="404040"/>
@@ -4036,6 +4146,12 @@
               <w:right w:val="single" w:sz="8" w:space="0" w:color="404040"/>
             </w:tcBorders>
             <w:shd w:fill="0A5455" w:val="clear"/>
+            <w:tcMar>
+              <w:top w:w="80" w:type="dxa"/>
+              <w:bottom w:w="80" w:type="dxa"/>
+              <w:left w:w="80" w:type="dxa"/>
+              <w:right w:w="80" w:type="dxa"/>
+            </w:tcMar>
           </w:tcPr>
           <w:p>
             <w:pPr>
@@ -4062,19 +4178,19 @@
         </w:tc>
         <w:tc>
           <w:tcPr>
-            <w:tcW w:type="dxa" w:w="1512"/>
-            <w:tcMar>
-              <w:top w:w="57" w:type="dxa"/>
-              <w:bottom w:w="57" w:type="dxa"/>
-              <w:left w:w="57" w:type="dxa"/>
-              <w:right w:w="57" w:type="dxa"/>
-            </w:tcMar>
+            <w:tcW w:type="dxa" w:w="4961"/>
             <w:tcBorders>
               <w:top w:val="single" w:sz="8" w:space="0" w:color="404040"/>
               <w:bottom w:val="single" w:sz="8" w:space="0" w:color="404040"/>
               <w:left w:val="single" w:sz="8" w:space="0" w:color="404040"/>
               <w:right w:val="single" w:sz="8" w:space="0" w:color="404040"/>
             </w:tcBorders>
+            <w:tcMar>
+              <w:top w:w="80" w:type="dxa"/>
+              <w:bottom w:w="80" w:type="dxa"/>
+              <w:left w:w="80" w:type="dxa"/>
+              <w:right w:w="80" w:type="dxa"/>
+            </w:tcMar>
           </w:tcPr>
           <w:p>
             <w:pPr>
@@ -4099,19 +4215,19 @@
         </w:tc>
         <w:tc>
           <w:tcPr>
-            <w:tcW w:type="dxa" w:w="1512"/>
-            <w:tcMar>
-              <w:top w:w="57" w:type="dxa"/>
-              <w:bottom w:w="57" w:type="dxa"/>
-              <w:left w:w="57" w:type="dxa"/>
-              <w:right w:w="57" w:type="dxa"/>
-            </w:tcMar>
+            <w:tcW w:type="dxa" w:w="850"/>
             <w:tcBorders>
               <w:top w:val="single" w:sz="8" w:space="0" w:color="404040"/>
               <w:bottom w:val="single" w:sz="8" w:space="0" w:color="404040"/>
               <w:left w:val="single" w:sz="8" w:space="0" w:color="404040"/>
               <w:right w:val="single" w:sz="8" w:space="0" w:color="404040"/>
             </w:tcBorders>
+            <w:tcMar>
+              <w:top w:w="80" w:type="dxa"/>
+              <w:bottom w:w="80" w:type="dxa"/>
+              <w:left w:w="80" w:type="dxa"/>
+              <w:right w:w="80" w:type="dxa"/>
+            </w:tcMar>
           </w:tcPr>
           <w:p>
             <w:pPr>
@@ -4135,19 +4251,19 @@
         </w:tc>
         <w:tc>
           <w:tcPr>
-            <w:tcW w:type="dxa" w:w="1512"/>
-            <w:tcMar>
-              <w:top w:w="57" w:type="dxa"/>
-              <w:bottom w:w="57" w:type="dxa"/>
-              <w:left w:w="57" w:type="dxa"/>
-              <w:right w:w="57" w:type="dxa"/>
-            </w:tcMar>
+            <w:tcW w:type="dxa" w:w="1063"/>
             <w:tcBorders>
               <w:top w:val="single" w:sz="8" w:space="0" w:color="404040"/>
               <w:bottom w:val="single" w:sz="8" w:space="0" w:color="404040"/>
               <w:left w:val="single" w:sz="8" w:space="0" w:color="404040"/>
               <w:right w:val="single" w:sz="8" w:space="0" w:color="404040"/>
             </w:tcBorders>
+            <w:tcMar>
+              <w:top w:w="80" w:type="dxa"/>
+              <w:bottom w:w="80" w:type="dxa"/>
+              <w:left w:w="80" w:type="dxa"/>
+              <w:right w:w="80" w:type="dxa"/>
+            </w:tcMar>
           </w:tcPr>
           <w:p>
             <w:pPr>
@@ -4171,19 +4287,19 @@
         </w:tc>
         <w:tc>
           <w:tcPr>
-            <w:tcW w:type="dxa" w:w="1512"/>
-            <w:tcMar>
-              <w:top w:w="57" w:type="dxa"/>
-              <w:bottom w:w="57" w:type="dxa"/>
-              <w:left w:w="57" w:type="dxa"/>
-              <w:right w:w="57" w:type="dxa"/>
-            </w:tcMar>
+            <w:tcW w:type="dxa" w:w="850"/>
             <w:tcBorders>
               <w:top w:val="single" w:sz="8" w:space="0" w:color="404040"/>
               <w:bottom w:val="single" w:sz="8" w:space="0" w:color="404040"/>
               <w:left w:val="single" w:sz="8" w:space="0" w:color="404040"/>
               <w:right w:val="single" w:sz="8" w:space="0" w:color="404040"/>
             </w:tcBorders>
+            <w:tcMar>
+              <w:top w:w="80" w:type="dxa"/>
+              <w:bottom w:w="80" w:type="dxa"/>
+              <w:left w:w="80" w:type="dxa"/>
+              <w:right w:w="80" w:type="dxa"/>
+            </w:tcMar>
           </w:tcPr>
           <w:p>
             <w:pPr>
@@ -4207,19 +4323,19 @@
         </w:tc>
         <w:tc>
           <w:tcPr>
-            <w:tcW w:type="dxa" w:w="1512"/>
-            <w:tcMar>
-              <w:top w:w="57" w:type="dxa"/>
-              <w:bottom w:w="57" w:type="dxa"/>
-              <w:left w:w="57" w:type="dxa"/>
-              <w:right w:w="57" w:type="dxa"/>
-            </w:tcMar>
+            <w:tcW w:type="dxa" w:w="1063"/>
             <w:tcBorders>
               <w:top w:val="single" w:sz="8" w:space="0" w:color="404040"/>
               <w:bottom w:val="single" w:sz="8" w:space="0" w:color="404040"/>
               <w:left w:val="single" w:sz="8" w:space="0" w:color="404040"/>
               <w:right w:val="single" w:sz="8" w:space="0" w:color="404040"/>
             </w:tcBorders>
+            <w:tcMar>
+              <w:top w:w="80" w:type="dxa"/>
+              <w:bottom w:w="80" w:type="dxa"/>
+              <w:left w:w="80" w:type="dxa"/>
+              <w:right w:w="80" w:type="dxa"/>
+            </w:tcMar>
           </w:tcPr>
           <w:p>
             <w:pPr>
@@ -4244,7 +4360,9 @@
       </w:tr>
     </w:tbl>
     <w:p>
-      <w:pPr/>
+      <w:pPr>
+        <w:spacing w:before="120"/>
+      </w:pPr>
       <w:r>
         <w:rPr>
           <w:color w:val="30302F"/>

</xml_diff>